<commit_message>
fix 5 logic error in 13 logic error when i review with my mentor in 13 march
</commit_message>
<xml_diff>
--- a/File Documents/Document about Education Management Project.docx
+++ b/File Documents/Document about Education Management Project.docx
@@ -596,6 +596,70 @@
     </w:p>
     <w:p/>
     <w:p>
+      <w:proofErr w:type="spellStart"/>
+      <w:r>
+        <w:t>Có</w:t>
+      </w:r>
+      <w:proofErr w:type="spellEnd"/>
+      <w:r>
+        <w:t xml:space="preserve"> </w:t>
+      </w:r>
+      <w:proofErr w:type="spellStart"/>
+      <w:r>
+        <w:t>dùng</w:t>
+      </w:r>
+      <w:proofErr w:type="spellEnd"/>
+      <w:r>
+        <w:t xml:space="preserve"> React Hook Form + </w:t>
+      </w:r>
+      <w:proofErr w:type="spellStart"/>
+      <w:r>
+        <w:t>Zod</w:t>
+      </w:r>
+      <w:proofErr w:type="spellEnd"/>
+      <w:r>
+        <w:t xml:space="preserve">/Yup </w:t>
+      </w:r>
+      <w:proofErr w:type="spellStart"/>
+      <w:r>
+        <w:t>cho</w:t>
+      </w:r>
+      <w:proofErr w:type="spellEnd"/>
+      <w:r>
+        <w:t xml:space="preserve"> </w:t>
+      </w:r>
+      <w:proofErr w:type="spellStart"/>
+      <w:r>
+        <w:t>chức</w:t>
+      </w:r>
+      <w:proofErr w:type="spellEnd"/>
+      <w:r>
+        <w:t xml:space="preserve"> </w:t>
+      </w:r>
+      <w:proofErr w:type="spellStart"/>
+      <w:r>
+        <w:t>năng</w:t>
+      </w:r>
+      <w:proofErr w:type="spellEnd"/>
+      <w:r>
+        <w:t xml:space="preserve"> </w:t>
+      </w:r>
+      <w:proofErr w:type="spellStart"/>
+      <w:r>
+        <w:t>đăng</w:t>
+      </w:r>
+      <w:proofErr w:type="spellEnd"/>
+      <w:r>
+        <w:t xml:space="preserve"> </w:t>
+      </w:r>
+      <w:proofErr w:type="spellStart"/>
+      <w:r>
+        <w:t>kí</w:t>
+      </w:r>
+      <w:proofErr w:type="spellEnd"/>
+    </w:p>
+    <w:p/>
+    <w:p>
       <w:pPr>
         <w:rPr>
           <w:b/>
@@ -909,7 +973,6 @@
           <w:sz w:val="40"/>
           <w:szCs w:val="40"/>
         </w:rPr>
-        <w:lastRenderedPageBreak/>
         <w:t>Nội</w:t>
       </w:r>
       <w:proofErr w:type="spellEnd"/>
@@ -1999,1029 +2062,1612 @@
     </w:p>
     <w:p/>
     <w:p/>
+    <w:tbl>
+      <w:tblPr>
+        <w:tblStyle w:val="TableGrid"/>
+        <w:tblW w:w="10435" w:type="dxa"/>
+        <w:tblLook w:val="04A0" w:firstRow="1" w:lastRow="0" w:firstColumn="1" w:lastColumn="0" w:noHBand="0" w:noVBand="1"/>
+      </w:tblPr>
+      <w:tblGrid>
+        <w:gridCol w:w="738"/>
+        <w:gridCol w:w="6268"/>
+        <w:gridCol w:w="1989"/>
+        <w:gridCol w:w="1440"/>
+      </w:tblGrid>
+      <w:tr>
+        <w:tc>
+          <w:tcPr>
+            <w:tcW w:w="738" w:type="dxa"/>
+          </w:tcPr>
+          <w:p>
+            <w:proofErr w:type="spellStart"/>
+            <w:r>
+              <w:t>Stt</w:t>
+            </w:r>
+            <w:proofErr w:type="spellEnd"/>
+          </w:p>
+        </w:tc>
+        <w:tc>
+          <w:tcPr>
+            <w:tcW w:w="6268" w:type="dxa"/>
+          </w:tcPr>
+          <w:p>
+            <w:r>
+              <w:t>Function</w:t>
+            </w:r>
+          </w:p>
+        </w:tc>
+        <w:tc>
+          <w:tcPr>
+            <w:tcW w:w="1989" w:type="dxa"/>
+          </w:tcPr>
+          <w:p>
+            <w:r>
+              <w:t>Way to solve</w:t>
+            </w:r>
+          </w:p>
+        </w:tc>
+        <w:tc>
+          <w:tcPr>
+            <w:tcW w:w="1440" w:type="dxa"/>
+          </w:tcPr>
+          <w:p>
+            <w:r>
+              <w:t>Done or not</w:t>
+            </w:r>
+          </w:p>
+        </w:tc>
+      </w:tr>
+      <w:tr>
+        <w:tc>
+          <w:tcPr>
+            <w:tcW w:w="738" w:type="dxa"/>
+          </w:tcPr>
+          <w:p>
+            <w:pPr>
+              <w:pStyle w:val="ListParagraph"/>
+              <w:numPr>
+                <w:ilvl w:val="0"/>
+                <w:numId w:val="3"/>
+              </w:numPr>
+            </w:pPr>
+          </w:p>
+        </w:tc>
+        <w:tc>
+          <w:tcPr>
+            <w:tcW w:w="6268" w:type="dxa"/>
+          </w:tcPr>
+          <w:p>
+            <w:pPr>
+              <w:pStyle w:val="ListParagraph"/>
+            </w:pPr>
+            <w:r>
+              <w:t xml:space="preserve">Gmail </w:t>
+            </w:r>
+            <w:proofErr w:type="spellStart"/>
+            <w:r>
+              <w:t>phải</w:t>
+            </w:r>
+            <w:proofErr w:type="spellEnd"/>
+            <w:r>
+              <w:t xml:space="preserve"> check </w:t>
+            </w:r>
+            <w:proofErr w:type="spellStart"/>
+            <w:r>
+              <w:t>có</w:t>
+            </w:r>
+            <w:proofErr w:type="spellEnd"/>
+            <w:r>
+              <w:t xml:space="preserve"> </w:t>
+            </w:r>
+            <w:proofErr w:type="spellStart"/>
+            <w:r>
+              <w:t>phải</w:t>
+            </w:r>
+            <w:proofErr w:type="spellEnd"/>
+            <w:r>
+              <w:t xml:space="preserve"> </w:t>
+            </w:r>
+            <w:proofErr w:type="spellStart"/>
+            <w:r>
+              <w:t>gmail</w:t>
+            </w:r>
+            <w:proofErr w:type="spellEnd"/>
+            <w:r>
+              <w:t xml:space="preserve"> </w:t>
+            </w:r>
+            <w:proofErr w:type="spellStart"/>
+            <w:r>
+              <w:t>không</w:t>
+            </w:r>
+            <w:proofErr w:type="spellEnd"/>
+          </w:p>
+          <w:p/>
+        </w:tc>
+        <w:tc>
+          <w:tcPr>
+            <w:tcW w:w="1989" w:type="dxa"/>
+          </w:tcPr>
+          <w:p>
+            <w:proofErr w:type="spellStart"/>
+            <w:r>
+              <w:t>Dùng</w:t>
+            </w:r>
+            <w:proofErr w:type="spellEnd"/>
+            <w:r>
+              <w:t xml:space="preserve"> React Hook Form + </w:t>
+            </w:r>
+            <w:proofErr w:type="spellStart"/>
+            <w:r>
+              <w:t>Zod</w:t>
+            </w:r>
+            <w:proofErr w:type="spellEnd"/>
+            <w:r>
+              <w:t>/Yup</w:t>
+            </w:r>
+          </w:p>
+        </w:tc>
+        <w:tc>
+          <w:tcPr>
+            <w:tcW w:w="1440" w:type="dxa"/>
+          </w:tcPr>
+          <w:p>
+            <w:r>
+              <w:t>Done</w:t>
+            </w:r>
+          </w:p>
+        </w:tc>
+      </w:tr>
+      <w:tr>
+        <w:trPr>
+          <w:trHeight w:val="368"/>
+        </w:trPr>
+        <w:tc>
+          <w:tcPr>
+            <w:tcW w:w="738" w:type="dxa"/>
+          </w:tcPr>
+          <w:p>
+            <w:pPr>
+              <w:pStyle w:val="ListParagraph"/>
+              <w:numPr>
+                <w:ilvl w:val="0"/>
+                <w:numId w:val="3"/>
+              </w:numPr>
+            </w:pPr>
+          </w:p>
+        </w:tc>
+        <w:tc>
+          <w:tcPr>
+            <w:tcW w:w="6268" w:type="dxa"/>
+          </w:tcPr>
+          <w:p>
+            <w:pPr>
+              <w:pStyle w:val="ListParagraph"/>
+            </w:pPr>
+            <w:r>
+              <w:t xml:space="preserve">SDT </w:t>
+            </w:r>
+            <w:proofErr w:type="spellStart"/>
+            <w:r>
+              <w:t>phải</w:t>
+            </w:r>
+            <w:proofErr w:type="spellEnd"/>
+            <w:r>
+              <w:t xml:space="preserve"> check</w:t>
+            </w:r>
+          </w:p>
+          <w:p/>
+        </w:tc>
+        <w:tc>
+          <w:tcPr>
+            <w:tcW w:w="1989" w:type="dxa"/>
+          </w:tcPr>
+          <w:p>
+            <w:proofErr w:type="spellStart"/>
+            <w:r>
+              <w:t>Dùng</w:t>
+            </w:r>
+            <w:proofErr w:type="spellEnd"/>
+            <w:r>
+              <w:t xml:space="preserve"> React Hook Form + </w:t>
+            </w:r>
+            <w:proofErr w:type="spellStart"/>
+            <w:r>
+              <w:t>Zod</w:t>
+            </w:r>
+            <w:proofErr w:type="spellEnd"/>
+            <w:r>
+              <w:t>/Yup</w:t>
+            </w:r>
+          </w:p>
+        </w:tc>
+        <w:tc>
+          <w:tcPr>
+            <w:tcW w:w="1440" w:type="dxa"/>
+          </w:tcPr>
+          <w:p>
+            <w:r>
+              <w:t>Done</w:t>
+            </w:r>
+          </w:p>
+        </w:tc>
+      </w:tr>
+      <w:tr>
+        <w:tc>
+          <w:tcPr>
+            <w:tcW w:w="738" w:type="dxa"/>
+          </w:tcPr>
+          <w:p>
+            <w:pPr>
+              <w:pStyle w:val="ListParagraph"/>
+              <w:numPr>
+                <w:ilvl w:val="0"/>
+                <w:numId w:val="3"/>
+              </w:numPr>
+            </w:pPr>
+          </w:p>
+        </w:tc>
+        <w:tc>
+          <w:tcPr>
+            <w:tcW w:w="6268" w:type="dxa"/>
+          </w:tcPr>
+          <w:p>
+            <w:pPr>
+              <w:pStyle w:val="ListParagraph"/>
+            </w:pPr>
+            <w:proofErr w:type="spellStart"/>
+            <w:r>
+              <w:t>Tìm</w:t>
+            </w:r>
+            <w:proofErr w:type="spellEnd"/>
+            <w:r>
+              <w:t xml:space="preserve"> </w:t>
+            </w:r>
+            <w:proofErr w:type="spellStart"/>
+            <w:r>
+              <w:t>thư</w:t>
+            </w:r>
+            <w:proofErr w:type="spellEnd"/>
+            <w:r>
+              <w:t xml:space="preserve"> </w:t>
+            </w:r>
+            <w:proofErr w:type="spellStart"/>
+            <w:r>
+              <w:t>viện</w:t>
+            </w:r>
+            <w:proofErr w:type="spellEnd"/>
+            <w:r>
+              <w:t xml:space="preserve"> check </w:t>
+            </w:r>
+            <w:proofErr w:type="spellStart"/>
+            <w:r>
+              <w:t>chỗ</w:t>
+            </w:r>
+            <w:proofErr w:type="spellEnd"/>
+            <w:r>
+              <w:t xml:space="preserve"> </w:t>
+            </w:r>
+            <w:proofErr w:type="spellStart"/>
+            <w:r>
+              <w:t>nào</w:t>
+            </w:r>
+            <w:proofErr w:type="spellEnd"/>
+            <w:r>
+              <w:t xml:space="preserve"> </w:t>
+            </w:r>
+            <w:proofErr w:type="spellStart"/>
+            <w:r>
+              <w:t>lỗi</w:t>
+            </w:r>
+            <w:proofErr w:type="spellEnd"/>
+            <w:r>
+              <w:t xml:space="preserve"> </w:t>
+            </w:r>
+            <w:proofErr w:type="spellStart"/>
+            <w:r>
+              <w:t>thì</w:t>
+            </w:r>
+            <w:proofErr w:type="spellEnd"/>
+            <w:r>
+              <w:t xml:space="preserve"> </w:t>
+            </w:r>
+            <w:proofErr w:type="spellStart"/>
+            <w:r>
+              <w:t>tô</w:t>
+            </w:r>
+            <w:proofErr w:type="spellEnd"/>
+            <w:r>
+              <w:t xml:space="preserve"> </w:t>
+            </w:r>
+            <w:proofErr w:type="spellStart"/>
+            <w:r>
+              <w:t>đỏ</w:t>
+            </w:r>
+            <w:proofErr w:type="spellEnd"/>
+            <w:r>
+              <w:t xml:space="preserve"> </w:t>
+            </w:r>
+            <w:proofErr w:type="spellStart"/>
+            <w:r>
+              <w:t>lên</w:t>
+            </w:r>
+            <w:proofErr w:type="spellEnd"/>
+          </w:p>
+          <w:p>
+            <w:pPr>
+              <w:pStyle w:val="ListParagraph"/>
+            </w:pPr>
+            <w:proofErr w:type="spellStart"/>
+            <w:r>
+              <w:t>Trang</w:t>
+            </w:r>
+            <w:proofErr w:type="spellEnd"/>
+            <w:r>
+              <w:t xml:space="preserve"> </w:t>
+            </w:r>
+            <w:proofErr w:type="spellStart"/>
+            <w:r>
+              <w:t>myinfor</w:t>
+            </w:r>
+            <w:proofErr w:type="spellEnd"/>
+            <w:r>
+              <w:t>(</w:t>
+            </w:r>
+            <w:proofErr w:type="spellStart"/>
+            <w:r>
+              <w:t>khi</w:t>
+            </w:r>
+            <w:proofErr w:type="spellEnd"/>
+            <w:r>
+              <w:t xml:space="preserve"> </w:t>
+            </w:r>
+            <w:proofErr w:type="spellStart"/>
+            <w:r>
+              <w:t>sửa</w:t>
+            </w:r>
+            <w:proofErr w:type="spellEnd"/>
+            <w:r>
+              <w:t xml:space="preserve"> </w:t>
+            </w:r>
+            <w:proofErr w:type="spellStart"/>
+            <w:r>
+              <w:t>sđt</w:t>
+            </w:r>
+            <w:proofErr w:type="spellEnd"/>
+            <w:r>
+              <w:t xml:space="preserve">, </w:t>
+            </w:r>
+            <w:proofErr w:type="spellStart"/>
+            <w:r>
+              <w:t>gmail</w:t>
+            </w:r>
+            <w:proofErr w:type="spellEnd"/>
+            <w:r>
+              <w:t xml:space="preserve"> </w:t>
+            </w:r>
+            <w:proofErr w:type="spellStart"/>
+            <w:r>
+              <w:t>thì</w:t>
+            </w:r>
+            <w:proofErr w:type="spellEnd"/>
+            <w:r>
+              <w:t xml:space="preserve"> </w:t>
+            </w:r>
+            <w:proofErr w:type="spellStart"/>
+            <w:r>
+              <w:t>lỗi</w:t>
+            </w:r>
+            <w:proofErr w:type="spellEnd"/>
+            <w:r>
+              <w:t xml:space="preserve">), reload page </w:t>
+            </w:r>
+            <w:proofErr w:type="spellStart"/>
+            <w:r>
+              <w:t>sẽ</w:t>
+            </w:r>
+            <w:proofErr w:type="spellEnd"/>
+            <w:r>
+              <w:t xml:space="preserve"> </w:t>
+            </w:r>
+            <w:proofErr w:type="spellStart"/>
+            <w:r>
+              <w:t>ra</w:t>
+            </w:r>
+            <w:proofErr w:type="spellEnd"/>
+            <w:r>
+              <w:t xml:space="preserve"> </w:t>
+            </w:r>
+            <w:proofErr w:type="spellStart"/>
+            <w:r>
+              <w:t>lỗi</w:t>
+            </w:r>
+            <w:proofErr w:type="spellEnd"/>
+            <w:r>
+              <w:t xml:space="preserve"> exception</w:t>
+            </w:r>
+          </w:p>
+          <w:p/>
+        </w:tc>
+        <w:tc>
+          <w:tcPr>
+            <w:tcW w:w="1989" w:type="dxa"/>
+          </w:tcPr>
+          <w:p>
+            <w:proofErr w:type="spellStart"/>
+            <w:r>
+              <w:t>Dùng</w:t>
+            </w:r>
+            <w:proofErr w:type="spellEnd"/>
+            <w:r>
+              <w:t xml:space="preserve"> React Hook Form + </w:t>
+            </w:r>
+            <w:proofErr w:type="spellStart"/>
+            <w:r>
+              <w:t>Zod</w:t>
+            </w:r>
+            <w:proofErr w:type="spellEnd"/>
+            <w:r>
+              <w:t>/Yup</w:t>
+            </w:r>
+          </w:p>
+        </w:tc>
+        <w:tc>
+          <w:tcPr>
+            <w:tcW w:w="1440" w:type="dxa"/>
+          </w:tcPr>
+          <w:p>
+            <w:r>
+              <w:t>Done</w:t>
+            </w:r>
+          </w:p>
+        </w:tc>
+      </w:tr>
+      <w:tr>
+        <w:tc>
+          <w:tcPr>
+            <w:tcW w:w="738" w:type="dxa"/>
+          </w:tcPr>
+          <w:p>
+            <w:pPr>
+              <w:pStyle w:val="ListParagraph"/>
+              <w:numPr>
+                <w:ilvl w:val="0"/>
+                <w:numId w:val="3"/>
+              </w:numPr>
+            </w:pPr>
+          </w:p>
+        </w:tc>
+        <w:tc>
+          <w:tcPr>
+            <w:tcW w:w="6268" w:type="dxa"/>
+          </w:tcPr>
+          <w:p>
+            <w:pPr>
+              <w:pStyle w:val="ListParagraph"/>
+            </w:pPr>
+            <w:proofErr w:type="spellStart"/>
+            <w:r>
+              <w:t>Chỉnh</w:t>
+            </w:r>
+            <w:proofErr w:type="spellEnd"/>
+            <w:r>
+              <w:t xml:space="preserve"> </w:t>
+            </w:r>
+            <w:proofErr w:type="spellStart"/>
+            <w:r>
+              <w:t>cách</w:t>
+            </w:r>
+            <w:proofErr w:type="spellEnd"/>
+            <w:r>
+              <w:t xml:space="preserve"> </w:t>
+            </w:r>
+            <w:proofErr w:type="spellStart"/>
+            <w:r>
+              <w:t>Hiện</w:t>
+            </w:r>
+            <w:proofErr w:type="spellEnd"/>
+            <w:r>
+              <w:t xml:space="preserve"> exception(</w:t>
+            </w:r>
+            <w:proofErr w:type="spellStart"/>
+            <w:r>
+              <w:t>không</w:t>
+            </w:r>
+            <w:proofErr w:type="spellEnd"/>
+            <w:r>
+              <w:t xml:space="preserve"> </w:t>
+            </w:r>
+            <w:proofErr w:type="spellStart"/>
+            <w:r>
+              <w:t>hiện</w:t>
+            </w:r>
+            <w:proofErr w:type="spellEnd"/>
+            <w:r>
+              <w:t xml:space="preserve"> </w:t>
+            </w:r>
+            <w:proofErr w:type="spellStart"/>
+            <w:r>
+              <w:t>khi</w:t>
+            </w:r>
+            <w:proofErr w:type="spellEnd"/>
+            <w:r>
+              <w:t xml:space="preserve"> bay </w:t>
+            </w:r>
+            <w:proofErr w:type="spellStart"/>
+            <w:r>
+              <w:t>vào</w:t>
+            </w:r>
+            <w:proofErr w:type="spellEnd"/>
+            <w:r>
+              <w:t xml:space="preserve"> backend </w:t>
+            </w:r>
+            <w:proofErr w:type="spellStart"/>
+            <w:r>
+              <w:t>nữa</w:t>
+            </w:r>
+            <w:proofErr w:type="spellEnd"/>
+            <w:r>
+              <w:t>)</w:t>
+            </w:r>
+          </w:p>
+          <w:p/>
+        </w:tc>
+        <w:tc>
+          <w:tcPr>
+            <w:tcW w:w="1989" w:type="dxa"/>
+          </w:tcPr>
+          <w:p>
+            <w:proofErr w:type="spellStart"/>
+            <w:r>
+              <w:t>Chỉnh</w:t>
+            </w:r>
+            <w:proofErr w:type="spellEnd"/>
+            <w:r>
+              <w:t xml:space="preserve"> file middleware, </w:t>
+            </w:r>
+            <w:proofErr w:type="spellStart"/>
+            <w:r>
+              <w:t>bỏ</w:t>
+            </w:r>
+            <w:proofErr w:type="spellEnd"/>
+            <w:r>
+              <w:t xml:space="preserve"> tick </w:t>
+            </w:r>
+            <w:r>
+              <w:rPr>
+                <w:rFonts w:ascii="Segoe UI Symbol" w:hAnsi="Segoe UI Symbol" w:cs="Segoe UI Symbol"/>
+              </w:rPr>
+              <w:t>☐</w:t>
+            </w:r>
+            <w:r>
+              <w:t xml:space="preserve"> Break when this exception type is thrown</w:t>
+            </w:r>
+            <w:r>
+              <w:t xml:space="preserve"> </w:t>
+            </w:r>
+            <w:proofErr w:type="spellStart"/>
+            <w:r>
+              <w:t>trong</w:t>
+            </w:r>
+            <w:proofErr w:type="spellEnd"/>
+            <w:r>
+              <w:t xml:space="preserve"> </w:t>
+            </w:r>
+            <w:proofErr w:type="spellStart"/>
+            <w:r>
+              <w:t>bảng</w:t>
+            </w:r>
+            <w:proofErr w:type="spellEnd"/>
+            <w:r>
+              <w:t xml:space="preserve"> exception </w:t>
+            </w:r>
+            <w:proofErr w:type="spellStart"/>
+            <w:r>
+              <w:t>khi</w:t>
+            </w:r>
+            <w:proofErr w:type="spellEnd"/>
+            <w:r>
+              <w:t xml:space="preserve"> </w:t>
+            </w:r>
+            <w:proofErr w:type="spellStart"/>
+            <w:r>
+              <w:t>lỗi</w:t>
+            </w:r>
+            <w:proofErr w:type="spellEnd"/>
+            <w:r>
+              <w:t xml:space="preserve"> bay </w:t>
+            </w:r>
+            <w:proofErr w:type="spellStart"/>
+            <w:r>
+              <w:t>vào</w:t>
+            </w:r>
+            <w:proofErr w:type="spellEnd"/>
+            <w:r>
+              <w:t xml:space="preserve"> </w:t>
+            </w:r>
+            <w:proofErr w:type="spellStart"/>
+            <w:r>
+              <w:t>môi</w:t>
+            </w:r>
+            <w:proofErr w:type="spellEnd"/>
+            <w:r>
+              <w:t xml:space="preserve"> trường</w:t>
+            </w:r>
+          </w:p>
+        </w:tc>
+        <w:tc>
+          <w:tcPr>
+            <w:tcW w:w="1440" w:type="dxa"/>
+          </w:tcPr>
+          <w:p>
+            <w:r>
+              <w:t>Done</w:t>
+            </w:r>
+          </w:p>
+        </w:tc>
+      </w:tr>
+      <w:tr>
+        <w:tc>
+          <w:tcPr>
+            <w:tcW w:w="738" w:type="dxa"/>
+          </w:tcPr>
+          <w:p>
+            <w:pPr>
+              <w:pStyle w:val="ListParagraph"/>
+              <w:numPr>
+                <w:ilvl w:val="0"/>
+                <w:numId w:val="3"/>
+              </w:numPr>
+            </w:pPr>
+          </w:p>
+        </w:tc>
+        <w:tc>
+          <w:tcPr>
+            <w:tcW w:w="6268" w:type="dxa"/>
+          </w:tcPr>
+          <w:p>
+            <w:pPr>
+              <w:pStyle w:val="ListParagraph"/>
+            </w:pPr>
+            <w:proofErr w:type="spellStart"/>
+            <w:r>
+              <w:t>Khi</w:t>
+            </w:r>
+            <w:proofErr w:type="spellEnd"/>
+            <w:r>
+              <w:t xml:space="preserve"> </w:t>
+            </w:r>
+            <w:proofErr w:type="spellStart"/>
+            <w:r>
+              <w:t>sửa</w:t>
+            </w:r>
+            <w:proofErr w:type="spellEnd"/>
+            <w:r>
+              <w:t xml:space="preserve"> lesson(file lesson </w:t>
+            </w:r>
+            <w:proofErr w:type="spellStart"/>
+            <w:r>
+              <w:t>phải</w:t>
+            </w:r>
+            <w:proofErr w:type="spellEnd"/>
+            <w:r>
+              <w:t xml:space="preserve"> </w:t>
+            </w:r>
+            <w:proofErr w:type="spellStart"/>
+            <w:r>
+              <w:t>còn</w:t>
+            </w:r>
+            <w:proofErr w:type="spellEnd"/>
+            <w:r>
+              <w:t xml:space="preserve">, </w:t>
+            </w:r>
+            <w:proofErr w:type="spellStart"/>
+            <w:r>
+              <w:t>không</w:t>
+            </w:r>
+            <w:proofErr w:type="spellEnd"/>
+            <w:r>
+              <w:t xml:space="preserve"> </w:t>
+            </w:r>
+            <w:proofErr w:type="spellStart"/>
+            <w:r>
+              <w:t>bị</w:t>
+            </w:r>
+            <w:proofErr w:type="spellEnd"/>
+            <w:r>
+              <w:t xml:space="preserve"> </w:t>
+            </w:r>
+            <w:proofErr w:type="spellStart"/>
+            <w:r>
+              <w:t>trôi</w:t>
+            </w:r>
+            <w:proofErr w:type="spellEnd"/>
+            <w:r>
+              <w:t>)</w:t>
+            </w:r>
+          </w:p>
+          <w:p/>
+        </w:tc>
+        <w:tc>
+          <w:tcPr>
+            <w:tcW w:w="1989" w:type="dxa"/>
+          </w:tcPr>
+          <w:p/>
+        </w:tc>
+        <w:tc>
+          <w:tcPr>
+            <w:tcW w:w="1440" w:type="dxa"/>
+          </w:tcPr>
+          <w:p>
+            <w:r>
+              <w:t>Done</w:t>
+            </w:r>
+            <w:bookmarkStart w:id="0" w:name="_GoBack"/>
+            <w:bookmarkEnd w:id="0"/>
+          </w:p>
+        </w:tc>
+      </w:tr>
+      <w:tr>
+        <w:tc>
+          <w:tcPr>
+            <w:tcW w:w="738" w:type="dxa"/>
+          </w:tcPr>
+          <w:p>
+            <w:pPr>
+              <w:pStyle w:val="ListParagraph"/>
+              <w:numPr>
+                <w:ilvl w:val="0"/>
+                <w:numId w:val="3"/>
+              </w:numPr>
+            </w:pPr>
+          </w:p>
+        </w:tc>
+        <w:tc>
+          <w:tcPr>
+            <w:tcW w:w="6268" w:type="dxa"/>
+          </w:tcPr>
+          <w:p>
+            <w:pPr>
+              <w:pStyle w:val="ListParagraph"/>
+            </w:pPr>
+            <w:proofErr w:type="spellStart"/>
+            <w:r>
+              <w:t>Phân</w:t>
+            </w:r>
+            <w:proofErr w:type="spellEnd"/>
+            <w:r>
+              <w:t xml:space="preserve"> </w:t>
+            </w:r>
+            <w:proofErr w:type="spellStart"/>
+            <w:r>
+              <w:t>trang</w:t>
+            </w:r>
+            <w:proofErr w:type="spellEnd"/>
+            <w:r>
+              <w:t xml:space="preserve"> </w:t>
+            </w:r>
+            <w:proofErr w:type="spellStart"/>
+            <w:r>
+              <w:t>cho</w:t>
+            </w:r>
+            <w:proofErr w:type="spellEnd"/>
+            <w:r>
+              <w:t xml:space="preserve"> lesson, virtual class(</w:t>
+            </w:r>
+            <w:proofErr w:type="spellStart"/>
+            <w:r>
+              <w:t>cho</w:t>
+            </w:r>
+            <w:proofErr w:type="spellEnd"/>
+            <w:r>
+              <w:t xml:space="preserve"> </w:t>
+            </w:r>
+            <w:proofErr w:type="spellStart"/>
+            <w:r>
+              <w:t>cả</w:t>
+            </w:r>
+            <w:proofErr w:type="spellEnd"/>
+            <w:r>
+              <w:t xml:space="preserve"> student </w:t>
+            </w:r>
+            <w:proofErr w:type="spellStart"/>
+            <w:r>
+              <w:t>và</w:t>
+            </w:r>
+            <w:proofErr w:type="spellEnd"/>
+            <w:r>
+              <w:t xml:space="preserve"> teacher)</w:t>
+            </w:r>
+          </w:p>
+          <w:p>
+            <w:pPr>
+              <w:ind w:left="360"/>
+            </w:pPr>
+          </w:p>
+        </w:tc>
+        <w:tc>
+          <w:tcPr>
+            <w:tcW w:w="1989" w:type="dxa"/>
+          </w:tcPr>
+          <w:p/>
+        </w:tc>
+        <w:tc>
+          <w:tcPr>
+            <w:tcW w:w="1440" w:type="dxa"/>
+          </w:tcPr>
+          <w:p/>
+        </w:tc>
+      </w:tr>
+      <w:tr>
+        <w:tc>
+          <w:tcPr>
+            <w:tcW w:w="738" w:type="dxa"/>
+          </w:tcPr>
+          <w:p>
+            <w:pPr>
+              <w:pStyle w:val="ListParagraph"/>
+              <w:numPr>
+                <w:ilvl w:val="0"/>
+                <w:numId w:val="3"/>
+              </w:numPr>
+            </w:pPr>
+          </w:p>
+        </w:tc>
+        <w:tc>
+          <w:tcPr>
+            <w:tcW w:w="6268" w:type="dxa"/>
+          </w:tcPr>
+          <w:p>
+            <w:pPr>
+              <w:pStyle w:val="ListParagraph"/>
+            </w:pPr>
+            <w:proofErr w:type="spellStart"/>
+            <w:r>
+              <w:t>Tìm</w:t>
+            </w:r>
+            <w:proofErr w:type="spellEnd"/>
+            <w:r>
+              <w:t xml:space="preserve"> </w:t>
+            </w:r>
+            <w:proofErr w:type="spellStart"/>
+            <w:r>
+              <w:t>thư</w:t>
+            </w:r>
+            <w:proofErr w:type="spellEnd"/>
+            <w:r>
+              <w:t xml:space="preserve"> </w:t>
+            </w:r>
+            <w:proofErr w:type="spellStart"/>
+            <w:r>
+              <w:t>viện</w:t>
+            </w:r>
+            <w:proofErr w:type="spellEnd"/>
+            <w:r>
+              <w:t xml:space="preserve"> </w:t>
+            </w:r>
+            <w:proofErr w:type="spellStart"/>
+            <w:r>
+              <w:t>dùng</w:t>
+            </w:r>
+            <w:proofErr w:type="spellEnd"/>
+            <w:r>
+              <w:t xml:space="preserve"> </w:t>
+            </w:r>
+            <w:proofErr w:type="spellStart"/>
+            <w:r>
+              <w:t>để</w:t>
+            </w:r>
+            <w:proofErr w:type="spellEnd"/>
+            <w:r>
+              <w:t xml:space="preserve"> sort </w:t>
+            </w:r>
+            <w:proofErr w:type="spellStart"/>
+            <w:r>
+              <w:t>các</w:t>
+            </w:r>
+            <w:proofErr w:type="spellEnd"/>
+            <w:r>
+              <w:t xml:space="preserve"> lesson</w:t>
+            </w:r>
+          </w:p>
+          <w:p/>
+        </w:tc>
+        <w:tc>
+          <w:tcPr>
+            <w:tcW w:w="1989" w:type="dxa"/>
+          </w:tcPr>
+          <w:p/>
+        </w:tc>
+        <w:tc>
+          <w:tcPr>
+            <w:tcW w:w="1440" w:type="dxa"/>
+          </w:tcPr>
+          <w:p/>
+        </w:tc>
+      </w:tr>
+      <w:tr>
+        <w:tc>
+          <w:tcPr>
+            <w:tcW w:w="738" w:type="dxa"/>
+          </w:tcPr>
+          <w:p>
+            <w:pPr>
+              <w:pStyle w:val="ListParagraph"/>
+              <w:numPr>
+                <w:ilvl w:val="0"/>
+                <w:numId w:val="3"/>
+              </w:numPr>
+            </w:pPr>
+          </w:p>
+        </w:tc>
+        <w:tc>
+          <w:tcPr>
+            <w:tcW w:w="6268" w:type="dxa"/>
+          </w:tcPr>
+          <w:p>
+            <w:pPr>
+              <w:pStyle w:val="ListParagraph"/>
+            </w:pPr>
+            <w:r>
+              <w:t xml:space="preserve">Check </w:t>
+            </w:r>
+            <w:proofErr w:type="spellStart"/>
+            <w:r>
+              <w:t>không</w:t>
+            </w:r>
+            <w:proofErr w:type="spellEnd"/>
+            <w:r>
+              <w:t xml:space="preserve"> </w:t>
+            </w:r>
+            <w:proofErr w:type="spellStart"/>
+            <w:r>
+              <w:t>cho</w:t>
+            </w:r>
+            <w:proofErr w:type="spellEnd"/>
+            <w:r>
+              <w:t xml:space="preserve"> </w:t>
+            </w:r>
+            <w:proofErr w:type="spellStart"/>
+            <w:r>
+              <w:t>giáo</w:t>
+            </w:r>
+            <w:proofErr w:type="spellEnd"/>
+            <w:r>
+              <w:t xml:space="preserve"> </w:t>
+            </w:r>
+            <w:proofErr w:type="spellStart"/>
+            <w:r>
+              <w:t>viên</w:t>
+            </w:r>
+            <w:proofErr w:type="spellEnd"/>
+            <w:r>
+              <w:t xml:space="preserve"> </w:t>
+            </w:r>
+            <w:proofErr w:type="spellStart"/>
+            <w:r>
+              <w:t>tạo</w:t>
+            </w:r>
+            <w:proofErr w:type="spellEnd"/>
+            <w:r>
+              <w:t xml:space="preserve"> 2 </w:t>
+            </w:r>
+            <w:proofErr w:type="spellStart"/>
+            <w:r>
+              <w:t>bài</w:t>
+            </w:r>
+            <w:proofErr w:type="spellEnd"/>
+            <w:r>
+              <w:t xml:space="preserve"> y </w:t>
+            </w:r>
+            <w:proofErr w:type="spellStart"/>
+            <w:r>
+              <w:t>chang</w:t>
+            </w:r>
+            <w:proofErr w:type="spellEnd"/>
+            <w:r>
+              <w:t xml:space="preserve"> </w:t>
+            </w:r>
+            <w:proofErr w:type="spellStart"/>
+            <w:r>
+              <w:t>nhau</w:t>
+            </w:r>
+            <w:proofErr w:type="spellEnd"/>
+            <w:r>
+              <w:t>(</w:t>
+            </w:r>
+            <w:proofErr w:type="spellStart"/>
+            <w:r>
+              <w:t>dựa</w:t>
+            </w:r>
+            <w:proofErr w:type="spellEnd"/>
+            <w:r>
+              <w:t xml:space="preserve"> </w:t>
+            </w:r>
+            <w:proofErr w:type="spellStart"/>
+            <w:r>
+              <w:t>theo</w:t>
+            </w:r>
+            <w:proofErr w:type="spellEnd"/>
+            <w:r>
+              <w:t xml:space="preserve"> </w:t>
+            </w:r>
+            <w:proofErr w:type="spellStart"/>
+            <w:r>
+              <w:t>cột</w:t>
+            </w:r>
+            <w:proofErr w:type="spellEnd"/>
+            <w:r>
+              <w:t xml:space="preserve"> </w:t>
+            </w:r>
+            <w:proofErr w:type="spellStart"/>
+            <w:r>
+              <w:t>tên</w:t>
+            </w:r>
+            <w:proofErr w:type="spellEnd"/>
+            <w:r>
+              <w:t>)</w:t>
+            </w:r>
+          </w:p>
+          <w:p>
+            <w:pPr>
+              <w:pStyle w:val="ListParagraph"/>
+            </w:pPr>
+          </w:p>
+        </w:tc>
+        <w:tc>
+          <w:tcPr>
+            <w:tcW w:w="1989" w:type="dxa"/>
+          </w:tcPr>
+          <w:p/>
+        </w:tc>
+        <w:tc>
+          <w:tcPr>
+            <w:tcW w:w="1440" w:type="dxa"/>
+          </w:tcPr>
+          <w:p/>
+        </w:tc>
+      </w:tr>
+      <w:tr>
+        <w:tc>
+          <w:tcPr>
+            <w:tcW w:w="738" w:type="dxa"/>
+          </w:tcPr>
+          <w:p>
+            <w:pPr>
+              <w:pStyle w:val="ListParagraph"/>
+              <w:numPr>
+                <w:ilvl w:val="0"/>
+                <w:numId w:val="3"/>
+              </w:numPr>
+            </w:pPr>
+          </w:p>
+        </w:tc>
+        <w:tc>
+          <w:tcPr>
+            <w:tcW w:w="6268" w:type="dxa"/>
+          </w:tcPr>
+          <w:p>
+            <w:pPr>
+              <w:pStyle w:val="ListParagraph"/>
+            </w:pPr>
+            <w:proofErr w:type="spellStart"/>
+            <w:r>
+              <w:t>Đưa</w:t>
+            </w:r>
+            <w:proofErr w:type="spellEnd"/>
+            <w:r>
+              <w:t xml:space="preserve"> </w:t>
+            </w:r>
+            <w:proofErr w:type="spellStart"/>
+            <w:r>
+              <w:t>nút</w:t>
+            </w:r>
+            <w:proofErr w:type="spellEnd"/>
+            <w:r>
+              <w:t xml:space="preserve"> </w:t>
+            </w:r>
+            <w:proofErr w:type="spellStart"/>
+            <w:r>
+              <w:t>tải</w:t>
+            </w:r>
+            <w:proofErr w:type="spellEnd"/>
+            <w:r>
+              <w:t xml:space="preserve"> </w:t>
+            </w:r>
+            <w:proofErr w:type="spellStart"/>
+            <w:r>
+              <w:t>xuống</w:t>
+            </w:r>
+            <w:proofErr w:type="spellEnd"/>
+            <w:r>
+              <w:t xml:space="preserve"> </w:t>
+            </w:r>
+            <w:proofErr w:type="spellStart"/>
+            <w:r>
+              <w:t>vaoof</w:t>
+            </w:r>
+            <w:proofErr w:type="spellEnd"/>
+            <w:r>
+              <w:t xml:space="preserve"> </w:t>
+            </w:r>
+            <w:proofErr w:type="spellStart"/>
+            <w:r>
+              <w:t>cột</w:t>
+            </w:r>
+            <w:proofErr w:type="spellEnd"/>
+            <w:r>
+              <w:t xml:space="preserve"> file, </w:t>
+            </w:r>
+            <w:proofErr w:type="spellStart"/>
+            <w:r>
+              <w:t>thêm</w:t>
+            </w:r>
+            <w:proofErr w:type="spellEnd"/>
+            <w:r>
+              <w:t xml:space="preserve"> 1 </w:t>
+            </w:r>
+            <w:proofErr w:type="spellStart"/>
+            <w:r>
+              <w:t>nút</w:t>
+            </w:r>
+            <w:proofErr w:type="spellEnd"/>
+            <w:r>
+              <w:t xml:space="preserve"> publish </w:t>
+            </w:r>
+            <w:proofErr w:type="spellStart"/>
+            <w:r>
+              <w:t>vào</w:t>
+            </w:r>
+            <w:proofErr w:type="spellEnd"/>
+            <w:r>
+              <w:t xml:space="preserve"> </w:t>
+            </w:r>
+            <w:proofErr w:type="spellStart"/>
+            <w:r>
+              <w:t>cột</w:t>
+            </w:r>
+            <w:proofErr w:type="spellEnd"/>
+            <w:r>
+              <w:t xml:space="preserve"> </w:t>
+            </w:r>
+            <w:proofErr w:type="spellStart"/>
+            <w:r>
+              <w:t>trạng</w:t>
+            </w:r>
+            <w:proofErr w:type="spellEnd"/>
+            <w:r>
+              <w:t xml:space="preserve"> </w:t>
+            </w:r>
+            <w:proofErr w:type="spellStart"/>
+            <w:r>
+              <w:t>thái</w:t>
+            </w:r>
+            <w:proofErr w:type="spellEnd"/>
+          </w:p>
+          <w:p>
+            <w:pPr>
+              <w:pStyle w:val="ListParagraph"/>
+            </w:pPr>
+          </w:p>
+        </w:tc>
+        <w:tc>
+          <w:tcPr>
+            <w:tcW w:w="1989" w:type="dxa"/>
+          </w:tcPr>
+          <w:p/>
+        </w:tc>
+        <w:tc>
+          <w:tcPr>
+            <w:tcW w:w="1440" w:type="dxa"/>
+          </w:tcPr>
+          <w:p/>
+        </w:tc>
+      </w:tr>
+      <w:tr>
+        <w:tc>
+          <w:tcPr>
+            <w:tcW w:w="738" w:type="dxa"/>
+          </w:tcPr>
+          <w:p>
+            <w:pPr>
+              <w:pStyle w:val="ListParagraph"/>
+              <w:numPr>
+                <w:ilvl w:val="0"/>
+                <w:numId w:val="3"/>
+              </w:numPr>
+            </w:pPr>
+          </w:p>
+        </w:tc>
+        <w:tc>
+          <w:tcPr>
+            <w:tcW w:w="6268" w:type="dxa"/>
+          </w:tcPr>
+          <w:p>
+            <w:pPr>
+              <w:pStyle w:val="ListParagraph"/>
+            </w:pPr>
+            <w:proofErr w:type="spellStart"/>
+            <w:r>
+              <w:t>Khi</w:t>
+            </w:r>
+            <w:proofErr w:type="spellEnd"/>
+            <w:r>
+              <w:t xml:space="preserve"> </w:t>
+            </w:r>
+            <w:proofErr w:type="spellStart"/>
+            <w:r>
+              <w:t>thêm</w:t>
+            </w:r>
+            <w:proofErr w:type="spellEnd"/>
+            <w:r>
+              <w:t xml:space="preserve"> </w:t>
+            </w:r>
+            <w:proofErr w:type="spellStart"/>
+            <w:r>
+              <w:t>lớp</w:t>
+            </w:r>
+            <w:proofErr w:type="spellEnd"/>
+            <w:r>
+              <w:t xml:space="preserve"> </w:t>
+            </w:r>
+            <w:proofErr w:type="spellStart"/>
+            <w:r>
+              <w:t>ảo</w:t>
+            </w:r>
+            <w:proofErr w:type="spellEnd"/>
+            <w:r>
+              <w:t xml:space="preserve"> </w:t>
+            </w:r>
+            <w:proofErr w:type="spellStart"/>
+            <w:r>
+              <w:t>thì</w:t>
+            </w:r>
+            <w:proofErr w:type="spellEnd"/>
+            <w:r>
+              <w:t xml:space="preserve"> </w:t>
+            </w:r>
+            <w:proofErr w:type="spellStart"/>
+            <w:r>
+              <w:t>khi</w:t>
+            </w:r>
+            <w:proofErr w:type="spellEnd"/>
+            <w:r>
+              <w:t xml:space="preserve"> </w:t>
+            </w:r>
+            <w:proofErr w:type="spellStart"/>
+            <w:r>
+              <w:t>sửa,phải</w:t>
+            </w:r>
+            <w:proofErr w:type="spellEnd"/>
+            <w:r>
+              <w:t xml:space="preserve"> </w:t>
+            </w:r>
+            <w:proofErr w:type="spellStart"/>
+            <w:r>
+              <w:t>giữ</w:t>
+            </w:r>
+            <w:proofErr w:type="spellEnd"/>
+            <w:r>
+              <w:t xml:space="preserve"> </w:t>
+            </w:r>
+            <w:proofErr w:type="spellStart"/>
+            <w:r>
+              <w:t>trạng</w:t>
+            </w:r>
+            <w:proofErr w:type="spellEnd"/>
+            <w:r>
+              <w:t xml:space="preserve"> </w:t>
+            </w:r>
+            <w:proofErr w:type="spellStart"/>
+            <w:r>
+              <w:t>thái</w:t>
+            </w:r>
+            <w:proofErr w:type="spellEnd"/>
+            <w:r>
+              <w:t xml:space="preserve"> </w:t>
+            </w:r>
+            <w:proofErr w:type="spellStart"/>
+            <w:r>
+              <w:t>của</w:t>
+            </w:r>
+            <w:proofErr w:type="spellEnd"/>
+            <w:r>
+              <w:t xml:space="preserve"> </w:t>
+            </w:r>
+            <w:proofErr w:type="spellStart"/>
+            <w:r>
+              <w:t>lớp</w:t>
+            </w:r>
+            <w:proofErr w:type="spellEnd"/>
+            <w:r>
+              <w:t xml:space="preserve">, </w:t>
+            </w:r>
+            <w:proofErr w:type="spellStart"/>
+            <w:r>
+              <w:t>môn</w:t>
+            </w:r>
+            <w:proofErr w:type="spellEnd"/>
+            <w:r>
+              <w:t xml:space="preserve"> </w:t>
+            </w:r>
+            <w:proofErr w:type="spellStart"/>
+            <w:r>
+              <w:t>học</w:t>
+            </w:r>
+            <w:proofErr w:type="spellEnd"/>
+          </w:p>
+          <w:p>
+            <w:pPr>
+              <w:pStyle w:val="ListParagraph"/>
+            </w:pPr>
+          </w:p>
+        </w:tc>
+        <w:tc>
+          <w:tcPr>
+            <w:tcW w:w="1989" w:type="dxa"/>
+          </w:tcPr>
+          <w:p/>
+        </w:tc>
+        <w:tc>
+          <w:tcPr>
+            <w:tcW w:w="1440" w:type="dxa"/>
+          </w:tcPr>
+          <w:p/>
+        </w:tc>
+      </w:tr>
+      <w:tr>
+        <w:tc>
+          <w:tcPr>
+            <w:tcW w:w="738" w:type="dxa"/>
+          </w:tcPr>
+          <w:p>
+            <w:pPr>
+              <w:pStyle w:val="ListParagraph"/>
+              <w:numPr>
+                <w:ilvl w:val="0"/>
+                <w:numId w:val="3"/>
+              </w:numPr>
+            </w:pPr>
+          </w:p>
+        </w:tc>
+        <w:tc>
+          <w:tcPr>
+            <w:tcW w:w="6268" w:type="dxa"/>
+          </w:tcPr>
+          <w:p>
+            <w:pPr>
+              <w:pStyle w:val="ListParagraph"/>
+            </w:pPr>
+            <w:proofErr w:type="spellStart"/>
+            <w:r>
+              <w:t>Phải</w:t>
+            </w:r>
+            <w:proofErr w:type="spellEnd"/>
+            <w:r>
+              <w:t xml:space="preserve"> check </w:t>
+            </w:r>
+            <w:proofErr w:type="spellStart"/>
+            <w:r>
+              <w:t>không</w:t>
+            </w:r>
+            <w:proofErr w:type="spellEnd"/>
+            <w:r>
+              <w:t xml:space="preserve"> </w:t>
+            </w:r>
+            <w:proofErr w:type="spellStart"/>
+            <w:r>
+              <w:t>cho</w:t>
+            </w:r>
+            <w:proofErr w:type="spellEnd"/>
+            <w:r>
+              <w:t xml:space="preserve"> 1 </w:t>
+            </w:r>
+            <w:proofErr w:type="spellStart"/>
+            <w:r>
+              <w:t>ông</w:t>
+            </w:r>
+            <w:proofErr w:type="spellEnd"/>
+            <w:r>
+              <w:t xml:space="preserve"> </w:t>
+            </w:r>
+            <w:proofErr w:type="spellStart"/>
+            <w:r>
+              <w:t>giáo</w:t>
+            </w:r>
+            <w:proofErr w:type="spellEnd"/>
+            <w:r>
+              <w:t xml:space="preserve"> </w:t>
+            </w:r>
+            <w:proofErr w:type="spellStart"/>
+            <w:r>
+              <w:t>viên</w:t>
+            </w:r>
+            <w:proofErr w:type="spellEnd"/>
+            <w:r>
+              <w:t xml:space="preserve">  </w:t>
+            </w:r>
+            <w:proofErr w:type="spellStart"/>
+            <w:r>
+              <w:t>tạo</w:t>
+            </w:r>
+            <w:proofErr w:type="spellEnd"/>
+            <w:r>
+              <w:t xml:space="preserve"> 2 </w:t>
+            </w:r>
+            <w:proofErr w:type="spellStart"/>
+            <w:r>
+              <w:t>lớp</w:t>
+            </w:r>
+            <w:proofErr w:type="spellEnd"/>
+            <w:r>
+              <w:t xml:space="preserve"> y </w:t>
+            </w:r>
+            <w:proofErr w:type="spellStart"/>
+            <w:r>
+              <w:t>chang</w:t>
+            </w:r>
+            <w:proofErr w:type="spellEnd"/>
+            <w:r>
+              <w:t xml:space="preserve"> </w:t>
+            </w:r>
+            <w:proofErr w:type="spellStart"/>
+            <w:r>
+              <w:t>nhau</w:t>
+            </w:r>
+            <w:proofErr w:type="spellEnd"/>
+            <w:r>
+              <w:t>(</w:t>
+            </w:r>
+            <w:proofErr w:type="spellStart"/>
+            <w:r>
+              <w:t>cùng</w:t>
+            </w:r>
+            <w:proofErr w:type="spellEnd"/>
+            <w:r>
+              <w:t xml:space="preserve">  </w:t>
+            </w:r>
+            <w:proofErr w:type="spellStart"/>
+            <w:r>
+              <w:t>lớp,cùng</w:t>
+            </w:r>
+            <w:proofErr w:type="spellEnd"/>
+            <w:r>
+              <w:t xml:space="preserve"> </w:t>
+            </w:r>
+            <w:proofErr w:type="spellStart"/>
+            <w:r>
+              <w:t>giờ</w:t>
+            </w:r>
+            <w:proofErr w:type="spellEnd"/>
+            <w:r>
+              <w:t>)</w:t>
+            </w:r>
+          </w:p>
+          <w:p>
+            <w:pPr>
+              <w:pStyle w:val="ListParagraph"/>
+            </w:pPr>
+          </w:p>
+        </w:tc>
+        <w:tc>
+          <w:tcPr>
+            <w:tcW w:w="1989" w:type="dxa"/>
+          </w:tcPr>
+          <w:p/>
+        </w:tc>
+        <w:tc>
+          <w:tcPr>
+            <w:tcW w:w="1440" w:type="dxa"/>
+          </w:tcPr>
+          <w:p/>
+        </w:tc>
+      </w:tr>
+      <w:tr>
+        <w:tc>
+          <w:tcPr>
+            <w:tcW w:w="738" w:type="dxa"/>
+          </w:tcPr>
+          <w:p>
+            <w:pPr>
+              <w:pStyle w:val="ListParagraph"/>
+              <w:numPr>
+                <w:ilvl w:val="0"/>
+                <w:numId w:val="3"/>
+              </w:numPr>
+            </w:pPr>
+          </w:p>
+        </w:tc>
+        <w:tc>
+          <w:tcPr>
+            <w:tcW w:w="6268" w:type="dxa"/>
+          </w:tcPr>
+          <w:p>
+            <w:pPr>
+              <w:pStyle w:val="ListParagraph"/>
+            </w:pPr>
+            <w:proofErr w:type="spellStart"/>
+            <w:r>
+              <w:t>Khi</w:t>
+            </w:r>
+            <w:proofErr w:type="spellEnd"/>
+            <w:r>
+              <w:t xml:space="preserve"> </w:t>
+            </w:r>
+            <w:proofErr w:type="spellStart"/>
+            <w:r>
+              <w:t>tạo</w:t>
+            </w:r>
+            <w:proofErr w:type="spellEnd"/>
+            <w:r>
+              <w:t xml:space="preserve"> </w:t>
+            </w:r>
+            <w:proofErr w:type="spellStart"/>
+            <w:r>
+              <w:t>lớp</w:t>
+            </w:r>
+            <w:proofErr w:type="spellEnd"/>
+            <w:r>
+              <w:t xml:space="preserve"> start &lt; end </w:t>
+            </w:r>
+            <w:proofErr w:type="spellStart"/>
+            <w:r>
+              <w:t>thì</w:t>
+            </w:r>
+            <w:proofErr w:type="spellEnd"/>
+            <w:r>
+              <w:t xml:space="preserve"> </w:t>
+            </w:r>
+            <w:proofErr w:type="spellStart"/>
+            <w:r>
+              <w:t>phải</w:t>
+            </w:r>
+            <w:proofErr w:type="spellEnd"/>
+            <w:r>
+              <w:t xml:space="preserve"> </w:t>
+            </w:r>
+            <w:proofErr w:type="spellStart"/>
+            <w:r>
+              <w:t>hiện</w:t>
+            </w:r>
+            <w:proofErr w:type="spellEnd"/>
+            <w:r>
+              <w:t xml:space="preserve"> </w:t>
+            </w:r>
+            <w:proofErr w:type="spellStart"/>
+            <w:r>
+              <w:t>ra</w:t>
+            </w:r>
+            <w:proofErr w:type="spellEnd"/>
+            <w:r>
+              <w:t xml:space="preserve"> </w:t>
+            </w:r>
+            <w:proofErr w:type="spellStart"/>
+            <w:r>
+              <w:t>lỗi</w:t>
+            </w:r>
+            <w:proofErr w:type="spellEnd"/>
+          </w:p>
+          <w:p>
+            <w:pPr>
+              <w:pStyle w:val="ListParagraph"/>
+            </w:pPr>
+          </w:p>
+        </w:tc>
+        <w:tc>
+          <w:tcPr>
+            <w:tcW w:w="1989" w:type="dxa"/>
+          </w:tcPr>
+          <w:p/>
+        </w:tc>
+        <w:tc>
+          <w:tcPr>
+            <w:tcW w:w="1440" w:type="dxa"/>
+          </w:tcPr>
+          <w:p/>
+        </w:tc>
+      </w:tr>
+    </w:tbl>
     <w:p/>
-    <w:p>
-      <w:pPr>
-        <w:pStyle w:val="ListParagraph"/>
-        <w:numPr>
-          <w:ilvl w:val="0"/>
-          <w:numId w:val="2"/>
-        </w:numPr>
-      </w:pPr>
-      <w:r>
-        <w:t xml:space="preserve">Gmail </w:t>
-      </w:r>
-      <w:proofErr w:type="spellStart"/>
-      <w:r>
-        <w:t>phải</w:t>
-      </w:r>
-      <w:proofErr w:type="spellEnd"/>
-      <w:r>
-        <w:t xml:space="preserve"> check </w:t>
-      </w:r>
-      <w:proofErr w:type="spellStart"/>
-      <w:r>
-        <w:t>có</w:t>
-      </w:r>
-      <w:proofErr w:type="spellEnd"/>
-      <w:r>
-        <w:t xml:space="preserve"> </w:t>
-      </w:r>
-      <w:proofErr w:type="spellStart"/>
-      <w:r>
-        <w:t>phải</w:t>
-      </w:r>
-      <w:proofErr w:type="spellEnd"/>
-      <w:r>
-        <w:t xml:space="preserve"> </w:t>
-      </w:r>
-      <w:proofErr w:type="spellStart"/>
-      <w:r>
-        <w:t>gmail</w:t>
-      </w:r>
-      <w:proofErr w:type="spellEnd"/>
-      <w:r>
-        <w:t xml:space="preserve"> </w:t>
-      </w:r>
-      <w:proofErr w:type="spellStart"/>
-      <w:r>
-        <w:t>không</w:t>
-      </w:r>
-      <w:proofErr w:type="spellEnd"/>
-    </w:p>
-    <w:p>
-      <w:pPr>
-        <w:pStyle w:val="ListParagraph"/>
-        <w:numPr>
-          <w:ilvl w:val="0"/>
-          <w:numId w:val="2"/>
-        </w:numPr>
-      </w:pPr>
-      <w:r>
-        <w:t xml:space="preserve">SDT </w:t>
-      </w:r>
-      <w:proofErr w:type="spellStart"/>
-      <w:r>
-        <w:t>phải</w:t>
-      </w:r>
-      <w:proofErr w:type="spellEnd"/>
-      <w:r>
-        <w:t xml:space="preserve"> check</w:t>
-      </w:r>
-    </w:p>
-    <w:p>
-      <w:pPr>
-        <w:pStyle w:val="ListParagraph"/>
-        <w:numPr>
-          <w:ilvl w:val="0"/>
-          <w:numId w:val="2"/>
-        </w:numPr>
-      </w:pPr>
-      <w:proofErr w:type="spellStart"/>
-      <w:r>
-        <w:t>Tìm</w:t>
-      </w:r>
-      <w:proofErr w:type="spellEnd"/>
-      <w:r>
-        <w:t xml:space="preserve"> </w:t>
-      </w:r>
-      <w:proofErr w:type="spellStart"/>
-      <w:r>
-        <w:t>thư</w:t>
-      </w:r>
-      <w:proofErr w:type="spellEnd"/>
-      <w:r>
-        <w:t xml:space="preserve"> </w:t>
-      </w:r>
-      <w:proofErr w:type="spellStart"/>
-      <w:r>
-        <w:t>viện</w:t>
-      </w:r>
-      <w:proofErr w:type="spellEnd"/>
-      <w:r>
-        <w:t xml:space="preserve"> check </w:t>
-      </w:r>
-      <w:proofErr w:type="spellStart"/>
-      <w:r>
-        <w:t>chỗ</w:t>
-      </w:r>
-      <w:proofErr w:type="spellEnd"/>
-      <w:r>
-        <w:t xml:space="preserve"> </w:t>
-      </w:r>
-      <w:proofErr w:type="spellStart"/>
-      <w:r>
-        <w:t>nào</w:t>
-      </w:r>
-      <w:proofErr w:type="spellEnd"/>
-      <w:r>
-        <w:t xml:space="preserve"> </w:t>
-      </w:r>
-      <w:proofErr w:type="spellStart"/>
-      <w:r>
-        <w:t>lỗi</w:t>
-      </w:r>
-      <w:proofErr w:type="spellEnd"/>
-      <w:r>
-        <w:t xml:space="preserve"> </w:t>
-      </w:r>
-      <w:proofErr w:type="spellStart"/>
-      <w:r>
-        <w:t>thì</w:t>
-      </w:r>
-      <w:proofErr w:type="spellEnd"/>
-      <w:r>
-        <w:t xml:space="preserve"> </w:t>
-      </w:r>
-      <w:proofErr w:type="spellStart"/>
-      <w:r>
-        <w:t>tô</w:t>
-      </w:r>
-      <w:proofErr w:type="spellEnd"/>
-      <w:r>
-        <w:t xml:space="preserve"> </w:t>
-      </w:r>
-      <w:proofErr w:type="spellStart"/>
-      <w:r>
-        <w:t>đỏ</w:t>
-      </w:r>
-      <w:proofErr w:type="spellEnd"/>
-      <w:r>
-        <w:t xml:space="preserve"> </w:t>
-      </w:r>
-      <w:proofErr w:type="spellStart"/>
-      <w:r>
-        <w:t>lên</w:t>
-      </w:r>
-      <w:proofErr w:type="spellEnd"/>
-    </w:p>
-    <w:p>
-      <w:pPr>
-        <w:pStyle w:val="ListParagraph"/>
-        <w:numPr>
-          <w:ilvl w:val="0"/>
-          <w:numId w:val="2"/>
-        </w:numPr>
-      </w:pPr>
-      <w:proofErr w:type="spellStart"/>
-      <w:r>
-        <w:t>Trang</w:t>
-      </w:r>
-      <w:proofErr w:type="spellEnd"/>
-      <w:r>
-        <w:t xml:space="preserve"> </w:t>
-      </w:r>
-      <w:proofErr w:type="spellStart"/>
-      <w:r>
-        <w:t>myinfor</w:t>
-      </w:r>
-      <w:proofErr w:type="spellEnd"/>
-      <w:r>
-        <w:t>(</w:t>
-      </w:r>
-      <w:proofErr w:type="spellStart"/>
-      <w:r>
-        <w:t>khi</w:t>
-      </w:r>
-      <w:proofErr w:type="spellEnd"/>
-      <w:r>
-        <w:t xml:space="preserve"> </w:t>
-      </w:r>
-      <w:proofErr w:type="spellStart"/>
-      <w:r>
-        <w:t>sửa</w:t>
-      </w:r>
-      <w:proofErr w:type="spellEnd"/>
-      <w:r>
-        <w:t xml:space="preserve"> </w:t>
-      </w:r>
-      <w:proofErr w:type="spellStart"/>
-      <w:r>
-        <w:t>sđt</w:t>
-      </w:r>
-      <w:proofErr w:type="spellEnd"/>
-      <w:r>
-        <w:t xml:space="preserve">, </w:t>
-      </w:r>
-      <w:proofErr w:type="spellStart"/>
-      <w:r>
-        <w:t>gmail</w:t>
-      </w:r>
-      <w:proofErr w:type="spellEnd"/>
-      <w:r>
-        <w:t xml:space="preserve"> </w:t>
-      </w:r>
-      <w:proofErr w:type="spellStart"/>
-      <w:r>
-        <w:t>thì</w:t>
-      </w:r>
-      <w:proofErr w:type="spellEnd"/>
-      <w:r>
-        <w:t xml:space="preserve"> </w:t>
-      </w:r>
-      <w:proofErr w:type="spellStart"/>
-      <w:r>
-        <w:t>lỗi</w:t>
-      </w:r>
-      <w:proofErr w:type="spellEnd"/>
-      <w:r>
-        <w:t>)</w:t>
-      </w:r>
-      <w:r>
-        <w:t xml:space="preserve">, reload page </w:t>
-      </w:r>
-      <w:proofErr w:type="spellStart"/>
-      <w:r>
-        <w:t>sẽ</w:t>
-      </w:r>
-      <w:proofErr w:type="spellEnd"/>
-      <w:r>
-        <w:t xml:space="preserve"> </w:t>
-      </w:r>
-      <w:proofErr w:type="spellStart"/>
-      <w:r>
-        <w:t>ra</w:t>
-      </w:r>
-      <w:proofErr w:type="spellEnd"/>
-      <w:r>
-        <w:t xml:space="preserve"> </w:t>
-      </w:r>
-      <w:proofErr w:type="spellStart"/>
-      <w:r>
-        <w:t>lỗi</w:t>
-      </w:r>
-      <w:proofErr w:type="spellEnd"/>
-      <w:r>
-        <w:t xml:space="preserve"> exception</w:t>
-      </w:r>
-    </w:p>
-    <w:p>
-      <w:pPr>
-        <w:pStyle w:val="ListParagraph"/>
-        <w:numPr>
-          <w:ilvl w:val="0"/>
-          <w:numId w:val="2"/>
-        </w:numPr>
-      </w:pPr>
-      <w:proofErr w:type="spellStart"/>
-      <w:r>
-        <w:t>Chỉnh</w:t>
-      </w:r>
-      <w:proofErr w:type="spellEnd"/>
-      <w:r>
-        <w:t xml:space="preserve"> </w:t>
-      </w:r>
-      <w:proofErr w:type="spellStart"/>
-      <w:r>
-        <w:t>cách</w:t>
-      </w:r>
-      <w:proofErr w:type="spellEnd"/>
-      <w:r>
-        <w:t xml:space="preserve"> </w:t>
-      </w:r>
-      <w:proofErr w:type="spellStart"/>
-      <w:r>
-        <w:t>Hiện</w:t>
-      </w:r>
-      <w:proofErr w:type="spellEnd"/>
-      <w:r>
-        <w:t xml:space="preserve"> exception</w:t>
-      </w:r>
-      <w:r>
-        <w:t>(</w:t>
-      </w:r>
-      <w:proofErr w:type="spellStart"/>
-      <w:r>
-        <w:t>không</w:t>
-      </w:r>
-      <w:proofErr w:type="spellEnd"/>
-      <w:r>
-        <w:t xml:space="preserve"> </w:t>
-      </w:r>
-      <w:proofErr w:type="spellStart"/>
-      <w:r>
-        <w:t>hiện</w:t>
-      </w:r>
-      <w:proofErr w:type="spellEnd"/>
-      <w:r>
-        <w:t xml:space="preserve"> </w:t>
-      </w:r>
-      <w:proofErr w:type="spellStart"/>
-      <w:r>
-        <w:t>khi</w:t>
-      </w:r>
-      <w:proofErr w:type="spellEnd"/>
-      <w:r>
-        <w:t xml:space="preserve"> bay </w:t>
-      </w:r>
-      <w:proofErr w:type="spellStart"/>
-      <w:r>
-        <w:t>vào</w:t>
-      </w:r>
-      <w:proofErr w:type="spellEnd"/>
-      <w:r>
-        <w:t xml:space="preserve"> backend </w:t>
-      </w:r>
-      <w:proofErr w:type="spellStart"/>
-      <w:r>
-        <w:t>nữa</w:t>
-      </w:r>
-      <w:proofErr w:type="spellEnd"/>
-      <w:r>
-        <w:t>)</w:t>
-      </w:r>
-    </w:p>
-    <w:p>
-      <w:pPr>
-        <w:pStyle w:val="ListParagraph"/>
-        <w:numPr>
-          <w:ilvl w:val="0"/>
-          <w:numId w:val="2"/>
-        </w:numPr>
-      </w:pPr>
-      <w:proofErr w:type="spellStart"/>
-      <w:r>
-        <w:t>Khi</w:t>
-      </w:r>
-      <w:proofErr w:type="spellEnd"/>
-      <w:r>
-        <w:t xml:space="preserve"> </w:t>
-      </w:r>
-      <w:proofErr w:type="spellStart"/>
-      <w:r>
-        <w:t>sửa</w:t>
-      </w:r>
-      <w:proofErr w:type="spellEnd"/>
-      <w:r>
-        <w:t xml:space="preserve"> lesson(file lesson </w:t>
-      </w:r>
-      <w:proofErr w:type="spellStart"/>
-      <w:r>
-        <w:t>phải</w:t>
-      </w:r>
-      <w:proofErr w:type="spellEnd"/>
-      <w:r>
-        <w:t xml:space="preserve"> </w:t>
-      </w:r>
-      <w:proofErr w:type="spellStart"/>
-      <w:r>
-        <w:t>còn</w:t>
-      </w:r>
-      <w:proofErr w:type="spellEnd"/>
-      <w:r>
-        <w:t xml:space="preserve">, </w:t>
-      </w:r>
-      <w:proofErr w:type="spellStart"/>
-      <w:r>
-        <w:t>không</w:t>
-      </w:r>
-      <w:proofErr w:type="spellEnd"/>
-      <w:r>
-        <w:t xml:space="preserve"> </w:t>
-      </w:r>
-      <w:proofErr w:type="spellStart"/>
-      <w:r>
-        <w:t>bị</w:t>
-      </w:r>
-      <w:proofErr w:type="spellEnd"/>
-      <w:r>
-        <w:t xml:space="preserve"> </w:t>
-      </w:r>
-      <w:proofErr w:type="spellStart"/>
-      <w:r>
-        <w:t>trôi</w:t>
-      </w:r>
-      <w:proofErr w:type="spellEnd"/>
-      <w:r>
-        <w:t>)</w:t>
-      </w:r>
-    </w:p>
-    <w:p>
-      <w:pPr>
-        <w:pStyle w:val="ListParagraph"/>
-        <w:numPr>
-          <w:ilvl w:val="0"/>
-          <w:numId w:val="2"/>
-        </w:numPr>
-      </w:pPr>
-      <w:proofErr w:type="spellStart"/>
-      <w:r>
-        <w:t>Tìm</w:t>
-      </w:r>
-      <w:proofErr w:type="spellEnd"/>
-      <w:r>
-        <w:t xml:space="preserve"> </w:t>
-      </w:r>
-      <w:proofErr w:type="spellStart"/>
-      <w:r>
-        <w:t>thư</w:t>
-      </w:r>
-      <w:proofErr w:type="spellEnd"/>
-      <w:r>
-        <w:t xml:space="preserve"> </w:t>
-      </w:r>
-      <w:proofErr w:type="spellStart"/>
-      <w:r>
-        <w:t>viện</w:t>
-      </w:r>
-      <w:proofErr w:type="spellEnd"/>
-      <w:r>
-        <w:t xml:space="preserve"> </w:t>
-      </w:r>
-      <w:proofErr w:type="spellStart"/>
-      <w:r>
-        <w:t>dùng</w:t>
-      </w:r>
-      <w:proofErr w:type="spellEnd"/>
-      <w:r>
-        <w:t xml:space="preserve"> </w:t>
-      </w:r>
-      <w:proofErr w:type="spellStart"/>
-      <w:r>
-        <w:t>để</w:t>
-      </w:r>
-      <w:proofErr w:type="spellEnd"/>
-      <w:r>
-        <w:t xml:space="preserve"> sort </w:t>
-      </w:r>
-      <w:proofErr w:type="spellStart"/>
-      <w:r>
-        <w:t>các</w:t>
-      </w:r>
-      <w:proofErr w:type="spellEnd"/>
-      <w:r>
-        <w:t xml:space="preserve"> lesson</w:t>
-      </w:r>
-    </w:p>
-    <w:p>
-      <w:pPr>
-        <w:pStyle w:val="ListParagraph"/>
-        <w:numPr>
-          <w:ilvl w:val="0"/>
-          <w:numId w:val="2"/>
-        </w:numPr>
-      </w:pPr>
-      <w:proofErr w:type="spellStart"/>
-      <w:r>
-        <w:t>Phân</w:t>
-      </w:r>
-      <w:proofErr w:type="spellEnd"/>
-      <w:r>
-        <w:t xml:space="preserve"> </w:t>
-      </w:r>
-      <w:proofErr w:type="spellStart"/>
-      <w:r>
-        <w:t>trang</w:t>
-      </w:r>
-      <w:proofErr w:type="spellEnd"/>
-      <w:r>
-        <w:t xml:space="preserve"> </w:t>
-      </w:r>
-      <w:proofErr w:type="spellStart"/>
-      <w:r>
-        <w:t>cho</w:t>
-      </w:r>
-      <w:proofErr w:type="spellEnd"/>
-      <w:r>
-        <w:t xml:space="preserve"> lesson, virtual class</w:t>
-      </w:r>
-      <w:r>
-        <w:t>(</w:t>
-      </w:r>
-      <w:proofErr w:type="spellStart"/>
-      <w:r>
-        <w:t>cho</w:t>
-      </w:r>
-      <w:proofErr w:type="spellEnd"/>
-      <w:r>
-        <w:t xml:space="preserve"> </w:t>
-      </w:r>
-      <w:proofErr w:type="spellStart"/>
-      <w:r>
-        <w:t>cả</w:t>
-      </w:r>
-      <w:proofErr w:type="spellEnd"/>
-      <w:r>
-        <w:t xml:space="preserve"> student </w:t>
-      </w:r>
-      <w:proofErr w:type="spellStart"/>
-      <w:r>
-        <w:t>và</w:t>
-      </w:r>
-      <w:proofErr w:type="spellEnd"/>
-      <w:r>
-        <w:t xml:space="preserve"> teacher)</w:t>
-      </w:r>
-    </w:p>
-    <w:p>
-      <w:pPr>
-        <w:pStyle w:val="ListParagraph"/>
-        <w:numPr>
-          <w:ilvl w:val="0"/>
-          <w:numId w:val="2"/>
-        </w:numPr>
-      </w:pPr>
-      <w:r>
-        <w:t xml:space="preserve">Check </w:t>
-      </w:r>
-      <w:proofErr w:type="spellStart"/>
-      <w:r>
-        <w:t>không</w:t>
-      </w:r>
-      <w:proofErr w:type="spellEnd"/>
-      <w:r>
-        <w:t xml:space="preserve"> </w:t>
-      </w:r>
-      <w:proofErr w:type="spellStart"/>
-      <w:r>
-        <w:t>cho</w:t>
-      </w:r>
-      <w:proofErr w:type="spellEnd"/>
-      <w:r>
-        <w:t xml:space="preserve"> </w:t>
-      </w:r>
-      <w:proofErr w:type="spellStart"/>
-      <w:r>
-        <w:t>giáo</w:t>
-      </w:r>
-      <w:proofErr w:type="spellEnd"/>
-      <w:r>
-        <w:t xml:space="preserve"> </w:t>
-      </w:r>
-      <w:proofErr w:type="spellStart"/>
-      <w:r>
-        <w:t>viên</w:t>
-      </w:r>
-      <w:proofErr w:type="spellEnd"/>
-      <w:r>
-        <w:t xml:space="preserve"> </w:t>
-      </w:r>
-      <w:proofErr w:type="spellStart"/>
-      <w:r>
-        <w:t>tạo</w:t>
-      </w:r>
-      <w:proofErr w:type="spellEnd"/>
-      <w:r>
-        <w:t xml:space="preserve"> 2 </w:t>
-      </w:r>
-      <w:proofErr w:type="spellStart"/>
-      <w:r>
-        <w:t>bài</w:t>
-      </w:r>
-      <w:proofErr w:type="spellEnd"/>
-      <w:r>
-        <w:t xml:space="preserve"> y </w:t>
-      </w:r>
-      <w:proofErr w:type="spellStart"/>
-      <w:r>
-        <w:t>chang</w:t>
-      </w:r>
-      <w:proofErr w:type="spellEnd"/>
-      <w:r>
-        <w:t xml:space="preserve"> </w:t>
-      </w:r>
-      <w:proofErr w:type="spellStart"/>
-      <w:r>
-        <w:t>nhau</w:t>
-      </w:r>
-      <w:proofErr w:type="spellEnd"/>
-      <w:r>
-        <w:t>(</w:t>
-      </w:r>
-      <w:proofErr w:type="spellStart"/>
-      <w:r>
-        <w:t>dựa</w:t>
-      </w:r>
-      <w:proofErr w:type="spellEnd"/>
-      <w:r>
-        <w:t xml:space="preserve"> </w:t>
-      </w:r>
-      <w:proofErr w:type="spellStart"/>
-      <w:r>
-        <w:t>theo</w:t>
-      </w:r>
-      <w:proofErr w:type="spellEnd"/>
-      <w:r>
-        <w:t xml:space="preserve"> </w:t>
-      </w:r>
-      <w:proofErr w:type="spellStart"/>
-      <w:r>
-        <w:t>cột</w:t>
-      </w:r>
-      <w:proofErr w:type="spellEnd"/>
-      <w:r>
-        <w:t xml:space="preserve"> </w:t>
-      </w:r>
-      <w:proofErr w:type="spellStart"/>
-      <w:r>
-        <w:t>tên</w:t>
-      </w:r>
-      <w:proofErr w:type="spellEnd"/>
-      <w:r>
-        <w:t>)</w:t>
-      </w:r>
-    </w:p>
-    <w:p>
-      <w:pPr>
-        <w:pStyle w:val="ListParagraph"/>
-        <w:numPr>
-          <w:ilvl w:val="0"/>
-          <w:numId w:val="2"/>
-        </w:numPr>
-      </w:pPr>
-      <w:proofErr w:type="spellStart"/>
-      <w:r>
-        <w:lastRenderedPageBreak/>
-        <w:t>Đưa</w:t>
-      </w:r>
-      <w:proofErr w:type="spellEnd"/>
-      <w:r>
-        <w:t xml:space="preserve"> </w:t>
-      </w:r>
-      <w:proofErr w:type="spellStart"/>
-      <w:r>
-        <w:t>nút</w:t>
-      </w:r>
-      <w:proofErr w:type="spellEnd"/>
-      <w:r>
-        <w:t xml:space="preserve"> </w:t>
-      </w:r>
-      <w:proofErr w:type="spellStart"/>
-      <w:r>
-        <w:t>tải</w:t>
-      </w:r>
-      <w:proofErr w:type="spellEnd"/>
-      <w:r>
-        <w:t xml:space="preserve"> </w:t>
-      </w:r>
-      <w:proofErr w:type="spellStart"/>
-      <w:r>
-        <w:t>xuống</w:t>
-      </w:r>
-      <w:proofErr w:type="spellEnd"/>
-      <w:r>
-        <w:t xml:space="preserve"> </w:t>
-      </w:r>
-      <w:proofErr w:type="spellStart"/>
-      <w:r>
-        <w:t>vaoof</w:t>
-      </w:r>
-      <w:proofErr w:type="spellEnd"/>
-      <w:r>
-        <w:t xml:space="preserve"> </w:t>
-      </w:r>
-      <w:proofErr w:type="spellStart"/>
-      <w:r>
-        <w:t>cột</w:t>
-      </w:r>
-      <w:proofErr w:type="spellEnd"/>
-      <w:r>
-        <w:t xml:space="preserve"> file, </w:t>
-      </w:r>
-      <w:proofErr w:type="spellStart"/>
-      <w:r>
-        <w:t>thêm</w:t>
-      </w:r>
-      <w:proofErr w:type="spellEnd"/>
-      <w:r>
-        <w:t xml:space="preserve"> 1 </w:t>
-      </w:r>
-      <w:proofErr w:type="spellStart"/>
-      <w:r>
-        <w:t>nút</w:t>
-      </w:r>
-      <w:proofErr w:type="spellEnd"/>
-      <w:r>
-        <w:t xml:space="preserve"> publish </w:t>
-      </w:r>
-      <w:proofErr w:type="spellStart"/>
-      <w:r>
-        <w:t>vào</w:t>
-      </w:r>
-      <w:proofErr w:type="spellEnd"/>
-      <w:r>
-        <w:t xml:space="preserve"> </w:t>
-      </w:r>
-      <w:proofErr w:type="spellStart"/>
-      <w:r>
-        <w:t>cột</w:t>
-      </w:r>
-      <w:proofErr w:type="spellEnd"/>
-      <w:r>
-        <w:t xml:space="preserve"> </w:t>
-      </w:r>
-      <w:proofErr w:type="spellStart"/>
-      <w:r>
-        <w:t>trạng</w:t>
-      </w:r>
-      <w:proofErr w:type="spellEnd"/>
-      <w:r>
-        <w:t xml:space="preserve"> </w:t>
-      </w:r>
-      <w:proofErr w:type="spellStart"/>
-      <w:r>
-        <w:t>thái</w:t>
-      </w:r>
-      <w:proofErr w:type="spellEnd"/>
-    </w:p>
-    <w:p>
-      <w:pPr>
-        <w:pStyle w:val="ListParagraph"/>
-        <w:numPr>
-          <w:ilvl w:val="0"/>
-          <w:numId w:val="2"/>
-        </w:numPr>
-      </w:pPr>
-      <w:proofErr w:type="spellStart"/>
-      <w:r>
-        <w:t>Khi</w:t>
-      </w:r>
-      <w:proofErr w:type="spellEnd"/>
-      <w:r>
-        <w:t xml:space="preserve"> </w:t>
-      </w:r>
-      <w:proofErr w:type="spellStart"/>
-      <w:r>
-        <w:t>thêm</w:t>
-      </w:r>
-      <w:proofErr w:type="spellEnd"/>
-      <w:r>
-        <w:t xml:space="preserve"> </w:t>
-      </w:r>
-      <w:proofErr w:type="spellStart"/>
-      <w:r>
-        <w:t>lớp</w:t>
-      </w:r>
-      <w:proofErr w:type="spellEnd"/>
-      <w:r>
-        <w:t xml:space="preserve"> </w:t>
-      </w:r>
-      <w:proofErr w:type="spellStart"/>
-      <w:r>
-        <w:t>ảo</w:t>
-      </w:r>
-      <w:proofErr w:type="spellEnd"/>
-      <w:r>
-        <w:t xml:space="preserve"> </w:t>
-      </w:r>
-      <w:proofErr w:type="spellStart"/>
-      <w:r>
-        <w:t>thì</w:t>
-      </w:r>
-      <w:proofErr w:type="spellEnd"/>
-      <w:r>
-        <w:t xml:space="preserve"> </w:t>
-      </w:r>
-      <w:proofErr w:type="spellStart"/>
-      <w:r>
-        <w:t>khi</w:t>
-      </w:r>
-      <w:proofErr w:type="spellEnd"/>
-      <w:r>
-        <w:t xml:space="preserve"> </w:t>
-      </w:r>
-      <w:proofErr w:type="spellStart"/>
-      <w:r>
-        <w:t>sửa,phải</w:t>
-      </w:r>
-      <w:proofErr w:type="spellEnd"/>
-      <w:r>
-        <w:t xml:space="preserve"> </w:t>
-      </w:r>
-      <w:proofErr w:type="spellStart"/>
-      <w:r>
-        <w:t>giữ</w:t>
-      </w:r>
-      <w:proofErr w:type="spellEnd"/>
-      <w:r>
-        <w:t xml:space="preserve"> </w:t>
-      </w:r>
-      <w:proofErr w:type="spellStart"/>
-      <w:r>
-        <w:t>trạng</w:t>
-      </w:r>
-      <w:proofErr w:type="spellEnd"/>
-      <w:r>
-        <w:t xml:space="preserve"> </w:t>
-      </w:r>
-      <w:proofErr w:type="spellStart"/>
-      <w:r>
-        <w:t>thái</w:t>
-      </w:r>
-      <w:proofErr w:type="spellEnd"/>
-      <w:r>
-        <w:t xml:space="preserve"> </w:t>
-      </w:r>
-      <w:proofErr w:type="spellStart"/>
-      <w:r>
-        <w:t>của</w:t>
-      </w:r>
-      <w:proofErr w:type="spellEnd"/>
-      <w:r>
-        <w:t xml:space="preserve"> </w:t>
-      </w:r>
-      <w:proofErr w:type="spellStart"/>
-      <w:r>
-        <w:t>lớp</w:t>
-      </w:r>
-      <w:proofErr w:type="spellEnd"/>
-      <w:r>
-        <w:t xml:space="preserve">, </w:t>
-      </w:r>
-      <w:proofErr w:type="spellStart"/>
-      <w:r>
-        <w:t>môn</w:t>
-      </w:r>
-      <w:proofErr w:type="spellEnd"/>
-      <w:r>
-        <w:t xml:space="preserve"> </w:t>
-      </w:r>
-      <w:proofErr w:type="spellStart"/>
-      <w:r>
-        <w:t>học</w:t>
-      </w:r>
-      <w:proofErr w:type="spellEnd"/>
-    </w:p>
-    <w:p>
-      <w:pPr>
-        <w:pStyle w:val="ListParagraph"/>
-        <w:numPr>
-          <w:ilvl w:val="0"/>
-          <w:numId w:val="2"/>
-        </w:numPr>
-      </w:pPr>
-      <w:proofErr w:type="spellStart"/>
-      <w:r>
-        <w:t>Phải</w:t>
-      </w:r>
-      <w:proofErr w:type="spellEnd"/>
-      <w:r>
-        <w:t xml:space="preserve"> check </w:t>
-      </w:r>
-      <w:proofErr w:type="spellStart"/>
-      <w:r>
-        <w:t>không</w:t>
-      </w:r>
-      <w:proofErr w:type="spellEnd"/>
-      <w:r>
-        <w:t xml:space="preserve"> </w:t>
-      </w:r>
-      <w:proofErr w:type="spellStart"/>
-      <w:r>
-        <w:t>cho</w:t>
-      </w:r>
-      <w:proofErr w:type="spellEnd"/>
-      <w:r>
-        <w:t xml:space="preserve"> 1 </w:t>
-      </w:r>
-      <w:proofErr w:type="spellStart"/>
-      <w:r>
-        <w:t>ông</w:t>
-      </w:r>
-      <w:proofErr w:type="spellEnd"/>
-      <w:r>
-        <w:t xml:space="preserve"> </w:t>
-      </w:r>
-      <w:proofErr w:type="spellStart"/>
-      <w:r>
-        <w:t>giáo</w:t>
-      </w:r>
-      <w:proofErr w:type="spellEnd"/>
-      <w:r>
-        <w:t xml:space="preserve"> </w:t>
-      </w:r>
-      <w:proofErr w:type="spellStart"/>
-      <w:r>
-        <w:t>viên</w:t>
-      </w:r>
-      <w:proofErr w:type="spellEnd"/>
-      <w:r>
-        <w:t xml:space="preserve">  </w:t>
-      </w:r>
-      <w:proofErr w:type="spellStart"/>
-      <w:r>
-        <w:t>tạo</w:t>
-      </w:r>
-      <w:proofErr w:type="spellEnd"/>
-      <w:r>
-        <w:t xml:space="preserve"> 2 </w:t>
-      </w:r>
-      <w:proofErr w:type="spellStart"/>
-      <w:r>
-        <w:t>lớp</w:t>
-      </w:r>
-      <w:proofErr w:type="spellEnd"/>
-      <w:r>
-        <w:t xml:space="preserve"> y </w:t>
-      </w:r>
-      <w:proofErr w:type="spellStart"/>
-      <w:r>
-        <w:t>chang</w:t>
-      </w:r>
-      <w:proofErr w:type="spellEnd"/>
-      <w:r>
-        <w:t xml:space="preserve"> </w:t>
-      </w:r>
-      <w:proofErr w:type="spellStart"/>
-      <w:r>
-        <w:t>nhau</w:t>
-      </w:r>
-      <w:proofErr w:type="spellEnd"/>
-      <w:r>
-        <w:t>(</w:t>
-      </w:r>
-      <w:proofErr w:type="spellStart"/>
-      <w:r>
-        <w:t>cùng</w:t>
-      </w:r>
-      <w:proofErr w:type="spellEnd"/>
-      <w:r>
-        <w:t xml:space="preserve">  </w:t>
-      </w:r>
-      <w:proofErr w:type="spellStart"/>
-      <w:r>
-        <w:t>lớp,cùng</w:t>
-      </w:r>
-      <w:proofErr w:type="spellEnd"/>
-      <w:r>
-        <w:t xml:space="preserve"> </w:t>
-      </w:r>
-      <w:proofErr w:type="spellStart"/>
-      <w:r>
-        <w:t>giờ</w:t>
-      </w:r>
-      <w:proofErr w:type="spellEnd"/>
-      <w:r>
-        <w:t>)</w:t>
-      </w:r>
-    </w:p>
-    <w:p>
-      <w:pPr>
-        <w:pStyle w:val="ListParagraph"/>
-        <w:numPr>
-          <w:ilvl w:val="0"/>
-          <w:numId w:val="2"/>
-        </w:numPr>
-      </w:pPr>
-      <w:proofErr w:type="spellStart"/>
-      <w:r>
-        <w:t>Khi</w:t>
-      </w:r>
-      <w:proofErr w:type="spellEnd"/>
-      <w:r>
-        <w:t xml:space="preserve"> </w:t>
-      </w:r>
-      <w:proofErr w:type="spellStart"/>
-      <w:r>
-        <w:t>tạo</w:t>
-      </w:r>
-      <w:proofErr w:type="spellEnd"/>
-      <w:r>
-        <w:t xml:space="preserve"> </w:t>
-      </w:r>
-      <w:proofErr w:type="spellStart"/>
-      <w:r>
-        <w:t>lớp</w:t>
-      </w:r>
-      <w:proofErr w:type="spellEnd"/>
-      <w:r>
-        <w:t xml:space="preserve"> start &lt; end </w:t>
-      </w:r>
-      <w:proofErr w:type="spellStart"/>
-      <w:r>
-        <w:t>thì</w:t>
-      </w:r>
-      <w:proofErr w:type="spellEnd"/>
-      <w:r>
-        <w:t xml:space="preserve"> </w:t>
-      </w:r>
-      <w:proofErr w:type="spellStart"/>
-      <w:r>
-        <w:t>phải</w:t>
-      </w:r>
-      <w:proofErr w:type="spellEnd"/>
-      <w:r>
-        <w:t xml:space="preserve"> </w:t>
-      </w:r>
-      <w:proofErr w:type="spellStart"/>
-      <w:r>
-        <w:t>hiện</w:t>
-      </w:r>
-      <w:proofErr w:type="spellEnd"/>
-      <w:r>
-        <w:t xml:space="preserve"> </w:t>
-      </w:r>
-      <w:proofErr w:type="spellStart"/>
-      <w:r>
-        <w:t>ra</w:t>
-      </w:r>
-      <w:proofErr w:type="spellEnd"/>
-      <w:r>
-        <w:t xml:space="preserve"> lỗi</w:t>
-      </w:r>
-      <w:bookmarkStart w:id="0" w:name="_GoBack"/>
-      <w:bookmarkEnd w:id="0"/>
-    </w:p>
     <w:sectPr>
       <w:pgSz w:w="12240" w:h="15840"/>
       <w:pgMar w:top="1440" w:right="1440" w:bottom="1440" w:left="1440" w:header="720" w:footer="720" w:gutter="0"/>
@@ -3260,11 +3906,100 @@
       </w:rPr>
     </w:lvl>
   </w:abstractNum>
+  <w:abstractNum w:abstractNumId="2">
+    <w:nsid w:val="7BFB112F"/>
+    <w:multiLevelType w:val="hybridMultilevel"/>
+    <w:tmpl w:val="E51CF80A"/>
+    <w:lvl w:ilvl="0" w:tplc="0409000F">
+      <w:start w:val="1"/>
+      <w:numFmt w:val="decimal"/>
+      <w:lvlText w:val="%1."/>
+      <w:lvlJc w:val="left"/>
+      <w:pPr>
+        <w:ind w:left="720" w:hanging="360"/>
+      </w:pPr>
+    </w:lvl>
+    <w:lvl w:ilvl="1" w:tplc="04090019" w:tentative="1">
+      <w:start w:val="1"/>
+      <w:numFmt w:val="lowerLetter"/>
+      <w:lvlText w:val="%2."/>
+      <w:lvlJc w:val="left"/>
+      <w:pPr>
+        <w:ind w:left="1440" w:hanging="360"/>
+      </w:pPr>
+    </w:lvl>
+    <w:lvl w:ilvl="2" w:tplc="0409001B" w:tentative="1">
+      <w:start w:val="1"/>
+      <w:numFmt w:val="lowerRoman"/>
+      <w:lvlText w:val="%3."/>
+      <w:lvlJc w:val="right"/>
+      <w:pPr>
+        <w:ind w:left="2160" w:hanging="180"/>
+      </w:pPr>
+    </w:lvl>
+    <w:lvl w:ilvl="3" w:tplc="0409000F" w:tentative="1">
+      <w:start w:val="1"/>
+      <w:numFmt w:val="decimal"/>
+      <w:lvlText w:val="%4."/>
+      <w:lvlJc w:val="left"/>
+      <w:pPr>
+        <w:ind w:left="2880" w:hanging="360"/>
+      </w:pPr>
+    </w:lvl>
+    <w:lvl w:ilvl="4" w:tplc="04090019" w:tentative="1">
+      <w:start w:val="1"/>
+      <w:numFmt w:val="lowerLetter"/>
+      <w:lvlText w:val="%5."/>
+      <w:lvlJc w:val="left"/>
+      <w:pPr>
+        <w:ind w:left="3600" w:hanging="360"/>
+      </w:pPr>
+    </w:lvl>
+    <w:lvl w:ilvl="5" w:tplc="0409001B" w:tentative="1">
+      <w:start w:val="1"/>
+      <w:numFmt w:val="lowerRoman"/>
+      <w:lvlText w:val="%6."/>
+      <w:lvlJc w:val="right"/>
+      <w:pPr>
+        <w:ind w:left="4320" w:hanging="180"/>
+      </w:pPr>
+    </w:lvl>
+    <w:lvl w:ilvl="6" w:tplc="0409000F" w:tentative="1">
+      <w:start w:val="1"/>
+      <w:numFmt w:val="decimal"/>
+      <w:lvlText w:val="%7."/>
+      <w:lvlJc w:val="left"/>
+      <w:pPr>
+        <w:ind w:left="5040" w:hanging="360"/>
+      </w:pPr>
+    </w:lvl>
+    <w:lvl w:ilvl="7" w:tplc="04090019" w:tentative="1">
+      <w:start w:val="1"/>
+      <w:numFmt w:val="lowerLetter"/>
+      <w:lvlText w:val="%8."/>
+      <w:lvlJc w:val="left"/>
+      <w:pPr>
+        <w:ind w:left="5760" w:hanging="360"/>
+      </w:pPr>
+    </w:lvl>
+    <w:lvl w:ilvl="8" w:tplc="0409001B" w:tentative="1">
+      <w:start w:val="1"/>
+      <w:numFmt w:val="lowerRoman"/>
+      <w:lvlText w:val="%9."/>
+      <w:lvlJc w:val="right"/>
+      <w:pPr>
+        <w:ind w:left="6480" w:hanging="180"/>
+      </w:pPr>
+    </w:lvl>
+  </w:abstractNum>
   <w:num w:numId="1">
     <w:abstractNumId w:val="1"/>
   </w:num>
   <w:num w:numId="2">
     <w:abstractNumId w:val="0"/>
+  </w:num>
+  <w:num w:numId="3">
+    <w:abstractNumId w:val="2"/>
   </w:num>
 </w:numbering>
 </file>
@@ -3701,6 +4436,32 @@
       <w:contextualSpacing/>
     </w:pPr>
   </w:style>
+  <w:style w:type="table" w:styleId="TableGrid">
+    <w:name w:val="Table Grid"/>
+    <w:basedOn w:val="TableNormal"/>
+    <w:uiPriority w:val="39"/>
+    <w:rsid w:val="00C64B48"/>
+    <w:pPr>
+      <w:spacing w:after="0" w:line="240" w:lineRule="auto"/>
+    </w:pPr>
+    <w:tblPr>
+      <w:tblInd w:w="0" w:type="dxa"/>
+      <w:tblBorders>
+        <w:top w:val="single" w:sz="4" w:space="0" w:color="auto"/>
+        <w:left w:val="single" w:sz="4" w:space="0" w:color="auto"/>
+        <w:bottom w:val="single" w:sz="4" w:space="0" w:color="auto"/>
+        <w:right w:val="single" w:sz="4" w:space="0" w:color="auto"/>
+        <w:insideH w:val="single" w:sz="4" w:space="0" w:color="auto"/>
+        <w:insideV w:val="single" w:sz="4" w:space="0" w:color="auto"/>
+      </w:tblBorders>
+      <w:tblCellMar>
+        <w:top w:w="0" w:type="dxa"/>
+        <w:left w:w="108" w:type="dxa"/>
+        <w:bottom w:w="0" w:type="dxa"/>
+        <w:right w:w="108" w:type="dxa"/>
+      </w:tblCellMar>
+    </w:tblPr>
+  </w:style>
 </w:styles>
 </file>
 

</xml_diff>

<commit_message>
Update Document about Education Management Project.docx
</commit_message>
<xml_diff>
--- a/File Documents/Document about Education Management Project.docx
+++ b/File Documents/Document about Education Management Project.docx
@@ -596,6 +596,70 @@
     </w:p>
     <w:p/>
     <w:p>
+      <w:proofErr w:type="spellStart"/>
+      <w:r>
+        <w:t>Có</w:t>
+      </w:r>
+      <w:proofErr w:type="spellEnd"/>
+      <w:r>
+        <w:t xml:space="preserve"> </w:t>
+      </w:r>
+      <w:proofErr w:type="spellStart"/>
+      <w:r>
+        <w:t>dùng</w:t>
+      </w:r>
+      <w:proofErr w:type="spellEnd"/>
+      <w:r>
+        <w:t xml:space="preserve"> React Hook Form + </w:t>
+      </w:r>
+      <w:proofErr w:type="spellStart"/>
+      <w:r>
+        <w:t>Zod</w:t>
+      </w:r>
+      <w:proofErr w:type="spellEnd"/>
+      <w:r>
+        <w:t xml:space="preserve">/Yup </w:t>
+      </w:r>
+      <w:proofErr w:type="spellStart"/>
+      <w:r>
+        <w:t>cho</w:t>
+      </w:r>
+      <w:proofErr w:type="spellEnd"/>
+      <w:r>
+        <w:t xml:space="preserve"> </w:t>
+      </w:r>
+      <w:proofErr w:type="spellStart"/>
+      <w:r>
+        <w:t>chức</w:t>
+      </w:r>
+      <w:proofErr w:type="spellEnd"/>
+      <w:r>
+        <w:t xml:space="preserve"> </w:t>
+      </w:r>
+      <w:proofErr w:type="spellStart"/>
+      <w:r>
+        <w:t>năng</w:t>
+      </w:r>
+      <w:proofErr w:type="spellEnd"/>
+      <w:r>
+        <w:t xml:space="preserve"> </w:t>
+      </w:r>
+      <w:proofErr w:type="spellStart"/>
+      <w:r>
+        <w:t>đăng</w:t>
+      </w:r>
+      <w:proofErr w:type="spellEnd"/>
+      <w:r>
+        <w:t xml:space="preserve"> </w:t>
+      </w:r>
+      <w:proofErr w:type="spellStart"/>
+      <w:r>
+        <w:t>kí</w:t>
+      </w:r>
+      <w:proofErr w:type="spellEnd"/>
+    </w:p>
+    <w:p/>
+    <w:p>
       <w:pPr>
         <w:rPr>
           <w:b/>
@@ -909,7 +973,6 @@
           <w:sz w:val="40"/>
           <w:szCs w:val="40"/>
         </w:rPr>
-        <w:lastRenderedPageBreak/>
         <w:t>Nội</w:t>
       </w:r>
       <w:proofErr w:type="spellEnd"/>
@@ -1999,1029 +2062,1612 @@
     </w:p>
     <w:p/>
     <w:p/>
+    <w:tbl>
+      <w:tblPr>
+        <w:tblStyle w:val="TableGrid"/>
+        <w:tblW w:w="10435" w:type="dxa"/>
+        <w:tblLook w:val="04A0" w:firstRow="1" w:lastRow="0" w:firstColumn="1" w:lastColumn="0" w:noHBand="0" w:noVBand="1"/>
+      </w:tblPr>
+      <w:tblGrid>
+        <w:gridCol w:w="738"/>
+        <w:gridCol w:w="6268"/>
+        <w:gridCol w:w="1989"/>
+        <w:gridCol w:w="1440"/>
+      </w:tblGrid>
+      <w:tr>
+        <w:tc>
+          <w:tcPr>
+            <w:tcW w:w="738" w:type="dxa"/>
+          </w:tcPr>
+          <w:p>
+            <w:proofErr w:type="spellStart"/>
+            <w:r>
+              <w:t>Stt</w:t>
+            </w:r>
+            <w:proofErr w:type="spellEnd"/>
+          </w:p>
+        </w:tc>
+        <w:tc>
+          <w:tcPr>
+            <w:tcW w:w="6268" w:type="dxa"/>
+          </w:tcPr>
+          <w:p>
+            <w:r>
+              <w:t>Function</w:t>
+            </w:r>
+          </w:p>
+        </w:tc>
+        <w:tc>
+          <w:tcPr>
+            <w:tcW w:w="1989" w:type="dxa"/>
+          </w:tcPr>
+          <w:p>
+            <w:r>
+              <w:t>Way to solve</w:t>
+            </w:r>
+          </w:p>
+        </w:tc>
+        <w:tc>
+          <w:tcPr>
+            <w:tcW w:w="1440" w:type="dxa"/>
+          </w:tcPr>
+          <w:p>
+            <w:r>
+              <w:t>Done or not</w:t>
+            </w:r>
+          </w:p>
+        </w:tc>
+      </w:tr>
+      <w:tr>
+        <w:tc>
+          <w:tcPr>
+            <w:tcW w:w="738" w:type="dxa"/>
+          </w:tcPr>
+          <w:p>
+            <w:pPr>
+              <w:pStyle w:val="ListParagraph"/>
+              <w:numPr>
+                <w:ilvl w:val="0"/>
+                <w:numId w:val="3"/>
+              </w:numPr>
+            </w:pPr>
+          </w:p>
+        </w:tc>
+        <w:tc>
+          <w:tcPr>
+            <w:tcW w:w="6268" w:type="dxa"/>
+          </w:tcPr>
+          <w:p>
+            <w:pPr>
+              <w:pStyle w:val="ListParagraph"/>
+            </w:pPr>
+            <w:r>
+              <w:t xml:space="preserve">Gmail </w:t>
+            </w:r>
+            <w:proofErr w:type="spellStart"/>
+            <w:r>
+              <w:t>phải</w:t>
+            </w:r>
+            <w:proofErr w:type="spellEnd"/>
+            <w:r>
+              <w:t xml:space="preserve"> check </w:t>
+            </w:r>
+            <w:proofErr w:type="spellStart"/>
+            <w:r>
+              <w:t>có</w:t>
+            </w:r>
+            <w:proofErr w:type="spellEnd"/>
+            <w:r>
+              <w:t xml:space="preserve"> </w:t>
+            </w:r>
+            <w:proofErr w:type="spellStart"/>
+            <w:r>
+              <w:t>phải</w:t>
+            </w:r>
+            <w:proofErr w:type="spellEnd"/>
+            <w:r>
+              <w:t xml:space="preserve"> </w:t>
+            </w:r>
+            <w:proofErr w:type="spellStart"/>
+            <w:r>
+              <w:t>gmail</w:t>
+            </w:r>
+            <w:proofErr w:type="spellEnd"/>
+            <w:r>
+              <w:t xml:space="preserve"> </w:t>
+            </w:r>
+            <w:proofErr w:type="spellStart"/>
+            <w:r>
+              <w:t>không</w:t>
+            </w:r>
+            <w:proofErr w:type="spellEnd"/>
+          </w:p>
+          <w:p/>
+        </w:tc>
+        <w:tc>
+          <w:tcPr>
+            <w:tcW w:w="1989" w:type="dxa"/>
+          </w:tcPr>
+          <w:p>
+            <w:proofErr w:type="spellStart"/>
+            <w:r>
+              <w:t>Dùng</w:t>
+            </w:r>
+            <w:proofErr w:type="spellEnd"/>
+            <w:r>
+              <w:t xml:space="preserve"> React Hook Form + </w:t>
+            </w:r>
+            <w:proofErr w:type="spellStart"/>
+            <w:r>
+              <w:t>Zod</w:t>
+            </w:r>
+            <w:proofErr w:type="spellEnd"/>
+            <w:r>
+              <w:t>/Yup</w:t>
+            </w:r>
+          </w:p>
+        </w:tc>
+        <w:tc>
+          <w:tcPr>
+            <w:tcW w:w="1440" w:type="dxa"/>
+          </w:tcPr>
+          <w:p>
+            <w:r>
+              <w:t>Done</w:t>
+            </w:r>
+          </w:p>
+        </w:tc>
+      </w:tr>
+      <w:tr>
+        <w:trPr>
+          <w:trHeight w:val="368"/>
+        </w:trPr>
+        <w:tc>
+          <w:tcPr>
+            <w:tcW w:w="738" w:type="dxa"/>
+          </w:tcPr>
+          <w:p>
+            <w:pPr>
+              <w:pStyle w:val="ListParagraph"/>
+              <w:numPr>
+                <w:ilvl w:val="0"/>
+                <w:numId w:val="3"/>
+              </w:numPr>
+            </w:pPr>
+          </w:p>
+        </w:tc>
+        <w:tc>
+          <w:tcPr>
+            <w:tcW w:w="6268" w:type="dxa"/>
+          </w:tcPr>
+          <w:p>
+            <w:pPr>
+              <w:pStyle w:val="ListParagraph"/>
+            </w:pPr>
+            <w:r>
+              <w:t xml:space="preserve">SDT </w:t>
+            </w:r>
+            <w:proofErr w:type="spellStart"/>
+            <w:r>
+              <w:t>phải</w:t>
+            </w:r>
+            <w:proofErr w:type="spellEnd"/>
+            <w:r>
+              <w:t xml:space="preserve"> check</w:t>
+            </w:r>
+          </w:p>
+          <w:p/>
+        </w:tc>
+        <w:tc>
+          <w:tcPr>
+            <w:tcW w:w="1989" w:type="dxa"/>
+          </w:tcPr>
+          <w:p>
+            <w:proofErr w:type="spellStart"/>
+            <w:r>
+              <w:t>Dùng</w:t>
+            </w:r>
+            <w:proofErr w:type="spellEnd"/>
+            <w:r>
+              <w:t xml:space="preserve"> React Hook Form + </w:t>
+            </w:r>
+            <w:proofErr w:type="spellStart"/>
+            <w:r>
+              <w:t>Zod</w:t>
+            </w:r>
+            <w:proofErr w:type="spellEnd"/>
+            <w:r>
+              <w:t>/Yup</w:t>
+            </w:r>
+          </w:p>
+        </w:tc>
+        <w:tc>
+          <w:tcPr>
+            <w:tcW w:w="1440" w:type="dxa"/>
+          </w:tcPr>
+          <w:p>
+            <w:r>
+              <w:t>Done</w:t>
+            </w:r>
+          </w:p>
+        </w:tc>
+      </w:tr>
+      <w:tr>
+        <w:tc>
+          <w:tcPr>
+            <w:tcW w:w="738" w:type="dxa"/>
+          </w:tcPr>
+          <w:p>
+            <w:pPr>
+              <w:pStyle w:val="ListParagraph"/>
+              <w:numPr>
+                <w:ilvl w:val="0"/>
+                <w:numId w:val="3"/>
+              </w:numPr>
+            </w:pPr>
+          </w:p>
+        </w:tc>
+        <w:tc>
+          <w:tcPr>
+            <w:tcW w:w="6268" w:type="dxa"/>
+          </w:tcPr>
+          <w:p>
+            <w:pPr>
+              <w:pStyle w:val="ListParagraph"/>
+            </w:pPr>
+            <w:proofErr w:type="spellStart"/>
+            <w:r>
+              <w:t>Tìm</w:t>
+            </w:r>
+            <w:proofErr w:type="spellEnd"/>
+            <w:r>
+              <w:t xml:space="preserve"> </w:t>
+            </w:r>
+            <w:proofErr w:type="spellStart"/>
+            <w:r>
+              <w:t>thư</w:t>
+            </w:r>
+            <w:proofErr w:type="spellEnd"/>
+            <w:r>
+              <w:t xml:space="preserve"> </w:t>
+            </w:r>
+            <w:proofErr w:type="spellStart"/>
+            <w:r>
+              <w:t>viện</w:t>
+            </w:r>
+            <w:proofErr w:type="spellEnd"/>
+            <w:r>
+              <w:t xml:space="preserve"> check </w:t>
+            </w:r>
+            <w:proofErr w:type="spellStart"/>
+            <w:r>
+              <w:t>chỗ</w:t>
+            </w:r>
+            <w:proofErr w:type="spellEnd"/>
+            <w:r>
+              <w:t xml:space="preserve"> </w:t>
+            </w:r>
+            <w:proofErr w:type="spellStart"/>
+            <w:r>
+              <w:t>nào</w:t>
+            </w:r>
+            <w:proofErr w:type="spellEnd"/>
+            <w:r>
+              <w:t xml:space="preserve"> </w:t>
+            </w:r>
+            <w:proofErr w:type="spellStart"/>
+            <w:r>
+              <w:t>lỗi</w:t>
+            </w:r>
+            <w:proofErr w:type="spellEnd"/>
+            <w:r>
+              <w:t xml:space="preserve"> </w:t>
+            </w:r>
+            <w:proofErr w:type="spellStart"/>
+            <w:r>
+              <w:t>thì</w:t>
+            </w:r>
+            <w:proofErr w:type="spellEnd"/>
+            <w:r>
+              <w:t xml:space="preserve"> </w:t>
+            </w:r>
+            <w:proofErr w:type="spellStart"/>
+            <w:r>
+              <w:t>tô</w:t>
+            </w:r>
+            <w:proofErr w:type="spellEnd"/>
+            <w:r>
+              <w:t xml:space="preserve"> </w:t>
+            </w:r>
+            <w:proofErr w:type="spellStart"/>
+            <w:r>
+              <w:t>đỏ</w:t>
+            </w:r>
+            <w:proofErr w:type="spellEnd"/>
+            <w:r>
+              <w:t xml:space="preserve"> </w:t>
+            </w:r>
+            <w:proofErr w:type="spellStart"/>
+            <w:r>
+              <w:t>lên</w:t>
+            </w:r>
+            <w:proofErr w:type="spellEnd"/>
+          </w:p>
+          <w:p>
+            <w:pPr>
+              <w:pStyle w:val="ListParagraph"/>
+            </w:pPr>
+            <w:proofErr w:type="spellStart"/>
+            <w:r>
+              <w:t>Trang</w:t>
+            </w:r>
+            <w:proofErr w:type="spellEnd"/>
+            <w:r>
+              <w:t xml:space="preserve"> </w:t>
+            </w:r>
+            <w:proofErr w:type="spellStart"/>
+            <w:r>
+              <w:t>myinfor</w:t>
+            </w:r>
+            <w:proofErr w:type="spellEnd"/>
+            <w:r>
+              <w:t>(</w:t>
+            </w:r>
+            <w:proofErr w:type="spellStart"/>
+            <w:r>
+              <w:t>khi</w:t>
+            </w:r>
+            <w:proofErr w:type="spellEnd"/>
+            <w:r>
+              <w:t xml:space="preserve"> </w:t>
+            </w:r>
+            <w:proofErr w:type="spellStart"/>
+            <w:r>
+              <w:t>sửa</w:t>
+            </w:r>
+            <w:proofErr w:type="spellEnd"/>
+            <w:r>
+              <w:t xml:space="preserve"> </w:t>
+            </w:r>
+            <w:proofErr w:type="spellStart"/>
+            <w:r>
+              <w:t>sđt</w:t>
+            </w:r>
+            <w:proofErr w:type="spellEnd"/>
+            <w:r>
+              <w:t xml:space="preserve">, </w:t>
+            </w:r>
+            <w:proofErr w:type="spellStart"/>
+            <w:r>
+              <w:t>gmail</w:t>
+            </w:r>
+            <w:proofErr w:type="spellEnd"/>
+            <w:r>
+              <w:t xml:space="preserve"> </w:t>
+            </w:r>
+            <w:proofErr w:type="spellStart"/>
+            <w:r>
+              <w:t>thì</w:t>
+            </w:r>
+            <w:proofErr w:type="spellEnd"/>
+            <w:r>
+              <w:t xml:space="preserve"> </w:t>
+            </w:r>
+            <w:proofErr w:type="spellStart"/>
+            <w:r>
+              <w:t>lỗi</w:t>
+            </w:r>
+            <w:proofErr w:type="spellEnd"/>
+            <w:r>
+              <w:t xml:space="preserve">), reload page </w:t>
+            </w:r>
+            <w:proofErr w:type="spellStart"/>
+            <w:r>
+              <w:t>sẽ</w:t>
+            </w:r>
+            <w:proofErr w:type="spellEnd"/>
+            <w:r>
+              <w:t xml:space="preserve"> </w:t>
+            </w:r>
+            <w:proofErr w:type="spellStart"/>
+            <w:r>
+              <w:t>ra</w:t>
+            </w:r>
+            <w:proofErr w:type="spellEnd"/>
+            <w:r>
+              <w:t xml:space="preserve"> </w:t>
+            </w:r>
+            <w:proofErr w:type="spellStart"/>
+            <w:r>
+              <w:t>lỗi</w:t>
+            </w:r>
+            <w:proofErr w:type="spellEnd"/>
+            <w:r>
+              <w:t xml:space="preserve"> exception</w:t>
+            </w:r>
+          </w:p>
+          <w:p/>
+        </w:tc>
+        <w:tc>
+          <w:tcPr>
+            <w:tcW w:w="1989" w:type="dxa"/>
+          </w:tcPr>
+          <w:p>
+            <w:proofErr w:type="spellStart"/>
+            <w:r>
+              <w:t>Dùng</w:t>
+            </w:r>
+            <w:proofErr w:type="spellEnd"/>
+            <w:r>
+              <w:t xml:space="preserve"> React Hook Form + </w:t>
+            </w:r>
+            <w:proofErr w:type="spellStart"/>
+            <w:r>
+              <w:t>Zod</w:t>
+            </w:r>
+            <w:proofErr w:type="spellEnd"/>
+            <w:r>
+              <w:t>/Yup</w:t>
+            </w:r>
+          </w:p>
+        </w:tc>
+        <w:tc>
+          <w:tcPr>
+            <w:tcW w:w="1440" w:type="dxa"/>
+          </w:tcPr>
+          <w:p>
+            <w:r>
+              <w:t>Done</w:t>
+            </w:r>
+          </w:p>
+        </w:tc>
+      </w:tr>
+      <w:tr>
+        <w:tc>
+          <w:tcPr>
+            <w:tcW w:w="738" w:type="dxa"/>
+          </w:tcPr>
+          <w:p>
+            <w:pPr>
+              <w:pStyle w:val="ListParagraph"/>
+              <w:numPr>
+                <w:ilvl w:val="0"/>
+                <w:numId w:val="3"/>
+              </w:numPr>
+            </w:pPr>
+          </w:p>
+        </w:tc>
+        <w:tc>
+          <w:tcPr>
+            <w:tcW w:w="6268" w:type="dxa"/>
+          </w:tcPr>
+          <w:p>
+            <w:pPr>
+              <w:pStyle w:val="ListParagraph"/>
+            </w:pPr>
+            <w:proofErr w:type="spellStart"/>
+            <w:r>
+              <w:t>Chỉnh</w:t>
+            </w:r>
+            <w:proofErr w:type="spellEnd"/>
+            <w:r>
+              <w:t xml:space="preserve"> </w:t>
+            </w:r>
+            <w:proofErr w:type="spellStart"/>
+            <w:r>
+              <w:t>cách</w:t>
+            </w:r>
+            <w:proofErr w:type="spellEnd"/>
+            <w:r>
+              <w:t xml:space="preserve"> </w:t>
+            </w:r>
+            <w:proofErr w:type="spellStart"/>
+            <w:r>
+              <w:t>Hiện</w:t>
+            </w:r>
+            <w:proofErr w:type="spellEnd"/>
+            <w:r>
+              <w:t xml:space="preserve"> exception(</w:t>
+            </w:r>
+            <w:proofErr w:type="spellStart"/>
+            <w:r>
+              <w:t>không</w:t>
+            </w:r>
+            <w:proofErr w:type="spellEnd"/>
+            <w:r>
+              <w:t xml:space="preserve"> </w:t>
+            </w:r>
+            <w:proofErr w:type="spellStart"/>
+            <w:r>
+              <w:t>hiện</w:t>
+            </w:r>
+            <w:proofErr w:type="spellEnd"/>
+            <w:r>
+              <w:t xml:space="preserve"> </w:t>
+            </w:r>
+            <w:proofErr w:type="spellStart"/>
+            <w:r>
+              <w:t>khi</w:t>
+            </w:r>
+            <w:proofErr w:type="spellEnd"/>
+            <w:r>
+              <w:t xml:space="preserve"> bay </w:t>
+            </w:r>
+            <w:proofErr w:type="spellStart"/>
+            <w:r>
+              <w:t>vào</w:t>
+            </w:r>
+            <w:proofErr w:type="spellEnd"/>
+            <w:r>
+              <w:t xml:space="preserve"> backend </w:t>
+            </w:r>
+            <w:proofErr w:type="spellStart"/>
+            <w:r>
+              <w:t>nữa</w:t>
+            </w:r>
+            <w:proofErr w:type="spellEnd"/>
+            <w:r>
+              <w:t>)</w:t>
+            </w:r>
+          </w:p>
+          <w:p/>
+        </w:tc>
+        <w:tc>
+          <w:tcPr>
+            <w:tcW w:w="1989" w:type="dxa"/>
+          </w:tcPr>
+          <w:p>
+            <w:proofErr w:type="spellStart"/>
+            <w:r>
+              <w:t>Chỉnh</w:t>
+            </w:r>
+            <w:proofErr w:type="spellEnd"/>
+            <w:r>
+              <w:t xml:space="preserve"> file middleware, </w:t>
+            </w:r>
+            <w:proofErr w:type="spellStart"/>
+            <w:r>
+              <w:t>bỏ</w:t>
+            </w:r>
+            <w:proofErr w:type="spellEnd"/>
+            <w:r>
+              <w:t xml:space="preserve"> tick </w:t>
+            </w:r>
+            <w:r>
+              <w:rPr>
+                <w:rFonts w:ascii="Segoe UI Symbol" w:hAnsi="Segoe UI Symbol" w:cs="Segoe UI Symbol"/>
+              </w:rPr>
+              <w:t>☐</w:t>
+            </w:r>
+            <w:r>
+              <w:t xml:space="preserve"> Break when this exception type is thrown</w:t>
+            </w:r>
+            <w:r>
+              <w:t xml:space="preserve"> </w:t>
+            </w:r>
+            <w:proofErr w:type="spellStart"/>
+            <w:r>
+              <w:t>trong</w:t>
+            </w:r>
+            <w:proofErr w:type="spellEnd"/>
+            <w:r>
+              <w:t xml:space="preserve"> </w:t>
+            </w:r>
+            <w:proofErr w:type="spellStart"/>
+            <w:r>
+              <w:t>bảng</w:t>
+            </w:r>
+            <w:proofErr w:type="spellEnd"/>
+            <w:r>
+              <w:t xml:space="preserve"> exception </w:t>
+            </w:r>
+            <w:proofErr w:type="spellStart"/>
+            <w:r>
+              <w:t>khi</w:t>
+            </w:r>
+            <w:proofErr w:type="spellEnd"/>
+            <w:r>
+              <w:t xml:space="preserve"> </w:t>
+            </w:r>
+            <w:proofErr w:type="spellStart"/>
+            <w:r>
+              <w:t>lỗi</w:t>
+            </w:r>
+            <w:proofErr w:type="spellEnd"/>
+            <w:r>
+              <w:t xml:space="preserve"> bay </w:t>
+            </w:r>
+            <w:proofErr w:type="spellStart"/>
+            <w:r>
+              <w:t>vào</w:t>
+            </w:r>
+            <w:proofErr w:type="spellEnd"/>
+            <w:r>
+              <w:t xml:space="preserve"> </w:t>
+            </w:r>
+            <w:proofErr w:type="spellStart"/>
+            <w:r>
+              <w:t>môi</w:t>
+            </w:r>
+            <w:proofErr w:type="spellEnd"/>
+            <w:r>
+              <w:t xml:space="preserve"> trường</w:t>
+            </w:r>
+          </w:p>
+        </w:tc>
+        <w:tc>
+          <w:tcPr>
+            <w:tcW w:w="1440" w:type="dxa"/>
+          </w:tcPr>
+          <w:p>
+            <w:r>
+              <w:t>Done</w:t>
+            </w:r>
+          </w:p>
+        </w:tc>
+      </w:tr>
+      <w:tr>
+        <w:tc>
+          <w:tcPr>
+            <w:tcW w:w="738" w:type="dxa"/>
+          </w:tcPr>
+          <w:p>
+            <w:pPr>
+              <w:pStyle w:val="ListParagraph"/>
+              <w:numPr>
+                <w:ilvl w:val="0"/>
+                <w:numId w:val="3"/>
+              </w:numPr>
+            </w:pPr>
+          </w:p>
+        </w:tc>
+        <w:tc>
+          <w:tcPr>
+            <w:tcW w:w="6268" w:type="dxa"/>
+          </w:tcPr>
+          <w:p>
+            <w:pPr>
+              <w:pStyle w:val="ListParagraph"/>
+            </w:pPr>
+            <w:proofErr w:type="spellStart"/>
+            <w:r>
+              <w:t>Khi</w:t>
+            </w:r>
+            <w:proofErr w:type="spellEnd"/>
+            <w:r>
+              <w:t xml:space="preserve"> </w:t>
+            </w:r>
+            <w:proofErr w:type="spellStart"/>
+            <w:r>
+              <w:t>sửa</w:t>
+            </w:r>
+            <w:proofErr w:type="spellEnd"/>
+            <w:r>
+              <w:t xml:space="preserve"> lesson(file lesson </w:t>
+            </w:r>
+            <w:proofErr w:type="spellStart"/>
+            <w:r>
+              <w:t>phải</w:t>
+            </w:r>
+            <w:proofErr w:type="spellEnd"/>
+            <w:r>
+              <w:t xml:space="preserve"> </w:t>
+            </w:r>
+            <w:proofErr w:type="spellStart"/>
+            <w:r>
+              <w:t>còn</w:t>
+            </w:r>
+            <w:proofErr w:type="spellEnd"/>
+            <w:r>
+              <w:t xml:space="preserve">, </w:t>
+            </w:r>
+            <w:proofErr w:type="spellStart"/>
+            <w:r>
+              <w:t>không</w:t>
+            </w:r>
+            <w:proofErr w:type="spellEnd"/>
+            <w:r>
+              <w:t xml:space="preserve"> </w:t>
+            </w:r>
+            <w:proofErr w:type="spellStart"/>
+            <w:r>
+              <w:t>bị</w:t>
+            </w:r>
+            <w:proofErr w:type="spellEnd"/>
+            <w:r>
+              <w:t xml:space="preserve"> </w:t>
+            </w:r>
+            <w:proofErr w:type="spellStart"/>
+            <w:r>
+              <w:t>trôi</w:t>
+            </w:r>
+            <w:proofErr w:type="spellEnd"/>
+            <w:r>
+              <w:t>)</w:t>
+            </w:r>
+          </w:p>
+          <w:p/>
+        </w:tc>
+        <w:tc>
+          <w:tcPr>
+            <w:tcW w:w="1989" w:type="dxa"/>
+          </w:tcPr>
+          <w:p/>
+        </w:tc>
+        <w:tc>
+          <w:tcPr>
+            <w:tcW w:w="1440" w:type="dxa"/>
+          </w:tcPr>
+          <w:p>
+            <w:r>
+              <w:t>Done</w:t>
+            </w:r>
+            <w:bookmarkStart w:id="0" w:name="_GoBack"/>
+            <w:bookmarkEnd w:id="0"/>
+          </w:p>
+        </w:tc>
+      </w:tr>
+      <w:tr>
+        <w:tc>
+          <w:tcPr>
+            <w:tcW w:w="738" w:type="dxa"/>
+          </w:tcPr>
+          <w:p>
+            <w:pPr>
+              <w:pStyle w:val="ListParagraph"/>
+              <w:numPr>
+                <w:ilvl w:val="0"/>
+                <w:numId w:val="3"/>
+              </w:numPr>
+            </w:pPr>
+          </w:p>
+        </w:tc>
+        <w:tc>
+          <w:tcPr>
+            <w:tcW w:w="6268" w:type="dxa"/>
+          </w:tcPr>
+          <w:p>
+            <w:pPr>
+              <w:pStyle w:val="ListParagraph"/>
+            </w:pPr>
+            <w:proofErr w:type="spellStart"/>
+            <w:r>
+              <w:t>Phân</w:t>
+            </w:r>
+            <w:proofErr w:type="spellEnd"/>
+            <w:r>
+              <w:t xml:space="preserve"> </w:t>
+            </w:r>
+            <w:proofErr w:type="spellStart"/>
+            <w:r>
+              <w:t>trang</w:t>
+            </w:r>
+            <w:proofErr w:type="spellEnd"/>
+            <w:r>
+              <w:t xml:space="preserve"> </w:t>
+            </w:r>
+            <w:proofErr w:type="spellStart"/>
+            <w:r>
+              <w:t>cho</w:t>
+            </w:r>
+            <w:proofErr w:type="spellEnd"/>
+            <w:r>
+              <w:t xml:space="preserve"> lesson, virtual class(</w:t>
+            </w:r>
+            <w:proofErr w:type="spellStart"/>
+            <w:r>
+              <w:t>cho</w:t>
+            </w:r>
+            <w:proofErr w:type="spellEnd"/>
+            <w:r>
+              <w:t xml:space="preserve"> </w:t>
+            </w:r>
+            <w:proofErr w:type="spellStart"/>
+            <w:r>
+              <w:t>cả</w:t>
+            </w:r>
+            <w:proofErr w:type="spellEnd"/>
+            <w:r>
+              <w:t xml:space="preserve"> student </w:t>
+            </w:r>
+            <w:proofErr w:type="spellStart"/>
+            <w:r>
+              <w:t>và</w:t>
+            </w:r>
+            <w:proofErr w:type="spellEnd"/>
+            <w:r>
+              <w:t xml:space="preserve"> teacher)</w:t>
+            </w:r>
+          </w:p>
+          <w:p>
+            <w:pPr>
+              <w:ind w:left="360"/>
+            </w:pPr>
+          </w:p>
+        </w:tc>
+        <w:tc>
+          <w:tcPr>
+            <w:tcW w:w="1989" w:type="dxa"/>
+          </w:tcPr>
+          <w:p/>
+        </w:tc>
+        <w:tc>
+          <w:tcPr>
+            <w:tcW w:w="1440" w:type="dxa"/>
+          </w:tcPr>
+          <w:p/>
+        </w:tc>
+      </w:tr>
+      <w:tr>
+        <w:tc>
+          <w:tcPr>
+            <w:tcW w:w="738" w:type="dxa"/>
+          </w:tcPr>
+          <w:p>
+            <w:pPr>
+              <w:pStyle w:val="ListParagraph"/>
+              <w:numPr>
+                <w:ilvl w:val="0"/>
+                <w:numId w:val="3"/>
+              </w:numPr>
+            </w:pPr>
+          </w:p>
+        </w:tc>
+        <w:tc>
+          <w:tcPr>
+            <w:tcW w:w="6268" w:type="dxa"/>
+          </w:tcPr>
+          <w:p>
+            <w:pPr>
+              <w:pStyle w:val="ListParagraph"/>
+            </w:pPr>
+            <w:proofErr w:type="spellStart"/>
+            <w:r>
+              <w:t>Tìm</w:t>
+            </w:r>
+            <w:proofErr w:type="spellEnd"/>
+            <w:r>
+              <w:t xml:space="preserve"> </w:t>
+            </w:r>
+            <w:proofErr w:type="spellStart"/>
+            <w:r>
+              <w:t>thư</w:t>
+            </w:r>
+            <w:proofErr w:type="spellEnd"/>
+            <w:r>
+              <w:t xml:space="preserve"> </w:t>
+            </w:r>
+            <w:proofErr w:type="spellStart"/>
+            <w:r>
+              <w:t>viện</w:t>
+            </w:r>
+            <w:proofErr w:type="spellEnd"/>
+            <w:r>
+              <w:t xml:space="preserve"> </w:t>
+            </w:r>
+            <w:proofErr w:type="spellStart"/>
+            <w:r>
+              <w:t>dùng</w:t>
+            </w:r>
+            <w:proofErr w:type="spellEnd"/>
+            <w:r>
+              <w:t xml:space="preserve"> </w:t>
+            </w:r>
+            <w:proofErr w:type="spellStart"/>
+            <w:r>
+              <w:t>để</w:t>
+            </w:r>
+            <w:proofErr w:type="spellEnd"/>
+            <w:r>
+              <w:t xml:space="preserve"> sort </w:t>
+            </w:r>
+            <w:proofErr w:type="spellStart"/>
+            <w:r>
+              <w:t>các</w:t>
+            </w:r>
+            <w:proofErr w:type="spellEnd"/>
+            <w:r>
+              <w:t xml:space="preserve"> lesson</w:t>
+            </w:r>
+          </w:p>
+          <w:p/>
+        </w:tc>
+        <w:tc>
+          <w:tcPr>
+            <w:tcW w:w="1989" w:type="dxa"/>
+          </w:tcPr>
+          <w:p/>
+        </w:tc>
+        <w:tc>
+          <w:tcPr>
+            <w:tcW w:w="1440" w:type="dxa"/>
+          </w:tcPr>
+          <w:p/>
+        </w:tc>
+      </w:tr>
+      <w:tr>
+        <w:tc>
+          <w:tcPr>
+            <w:tcW w:w="738" w:type="dxa"/>
+          </w:tcPr>
+          <w:p>
+            <w:pPr>
+              <w:pStyle w:val="ListParagraph"/>
+              <w:numPr>
+                <w:ilvl w:val="0"/>
+                <w:numId w:val="3"/>
+              </w:numPr>
+            </w:pPr>
+          </w:p>
+        </w:tc>
+        <w:tc>
+          <w:tcPr>
+            <w:tcW w:w="6268" w:type="dxa"/>
+          </w:tcPr>
+          <w:p>
+            <w:pPr>
+              <w:pStyle w:val="ListParagraph"/>
+            </w:pPr>
+            <w:r>
+              <w:t xml:space="preserve">Check </w:t>
+            </w:r>
+            <w:proofErr w:type="spellStart"/>
+            <w:r>
+              <w:t>không</w:t>
+            </w:r>
+            <w:proofErr w:type="spellEnd"/>
+            <w:r>
+              <w:t xml:space="preserve"> </w:t>
+            </w:r>
+            <w:proofErr w:type="spellStart"/>
+            <w:r>
+              <w:t>cho</w:t>
+            </w:r>
+            <w:proofErr w:type="spellEnd"/>
+            <w:r>
+              <w:t xml:space="preserve"> </w:t>
+            </w:r>
+            <w:proofErr w:type="spellStart"/>
+            <w:r>
+              <w:t>giáo</w:t>
+            </w:r>
+            <w:proofErr w:type="spellEnd"/>
+            <w:r>
+              <w:t xml:space="preserve"> </w:t>
+            </w:r>
+            <w:proofErr w:type="spellStart"/>
+            <w:r>
+              <w:t>viên</w:t>
+            </w:r>
+            <w:proofErr w:type="spellEnd"/>
+            <w:r>
+              <w:t xml:space="preserve"> </w:t>
+            </w:r>
+            <w:proofErr w:type="spellStart"/>
+            <w:r>
+              <w:t>tạo</w:t>
+            </w:r>
+            <w:proofErr w:type="spellEnd"/>
+            <w:r>
+              <w:t xml:space="preserve"> 2 </w:t>
+            </w:r>
+            <w:proofErr w:type="spellStart"/>
+            <w:r>
+              <w:t>bài</w:t>
+            </w:r>
+            <w:proofErr w:type="spellEnd"/>
+            <w:r>
+              <w:t xml:space="preserve"> y </w:t>
+            </w:r>
+            <w:proofErr w:type="spellStart"/>
+            <w:r>
+              <w:t>chang</w:t>
+            </w:r>
+            <w:proofErr w:type="spellEnd"/>
+            <w:r>
+              <w:t xml:space="preserve"> </w:t>
+            </w:r>
+            <w:proofErr w:type="spellStart"/>
+            <w:r>
+              <w:t>nhau</w:t>
+            </w:r>
+            <w:proofErr w:type="spellEnd"/>
+            <w:r>
+              <w:t>(</w:t>
+            </w:r>
+            <w:proofErr w:type="spellStart"/>
+            <w:r>
+              <w:t>dựa</w:t>
+            </w:r>
+            <w:proofErr w:type="spellEnd"/>
+            <w:r>
+              <w:t xml:space="preserve"> </w:t>
+            </w:r>
+            <w:proofErr w:type="spellStart"/>
+            <w:r>
+              <w:t>theo</w:t>
+            </w:r>
+            <w:proofErr w:type="spellEnd"/>
+            <w:r>
+              <w:t xml:space="preserve"> </w:t>
+            </w:r>
+            <w:proofErr w:type="spellStart"/>
+            <w:r>
+              <w:t>cột</w:t>
+            </w:r>
+            <w:proofErr w:type="spellEnd"/>
+            <w:r>
+              <w:t xml:space="preserve"> </w:t>
+            </w:r>
+            <w:proofErr w:type="spellStart"/>
+            <w:r>
+              <w:t>tên</w:t>
+            </w:r>
+            <w:proofErr w:type="spellEnd"/>
+            <w:r>
+              <w:t>)</w:t>
+            </w:r>
+          </w:p>
+          <w:p>
+            <w:pPr>
+              <w:pStyle w:val="ListParagraph"/>
+            </w:pPr>
+          </w:p>
+        </w:tc>
+        <w:tc>
+          <w:tcPr>
+            <w:tcW w:w="1989" w:type="dxa"/>
+          </w:tcPr>
+          <w:p/>
+        </w:tc>
+        <w:tc>
+          <w:tcPr>
+            <w:tcW w:w="1440" w:type="dxa"/>
+          </w:tcPr>
+          <w:p/>
+        </w:tc>
+      </w:tr>
+      <w:tr>
+        <w:tc>
+          <w:tcPr>
+            <w:tcW w:w="738" w:type="dxa"/>
+          </w:tcPr>
+          <w:p>
+            <w:pPr>
+              <w:pStyle w:val="ListParagraph"/>
+              <w:numPr>
+                <w:ilvl w:val="0"/>
+                <w:numId w:val="3"/>
+              </w:numPr>
+            </w:pPr>
+          </w:p>
+        </w:tc>
+        <w:tc>
+          <w:tcPr>
+            <w:tcW w:w="6268" w:type="dxa"/>
+          </w:tcPr>
+          <w:p>
+            <w:pPr>
+              <w:pStyle w:val="ListParagraph"/>
+            </w:pPr>
+            <w:proofErr w:type="spellStart"/>
+            <w:r>
+              <w:t>Đưa</w:t>
+            </w:r>
+            <w:proofErr w:type="spellEnd"/>
+            <w:r>
+              <w:t xml:space="preserve"> </w:t>
+            </w:r>
+            <w:proofErr w:type="spellStart"/>
+            <w:r>
+              <w:t>nút</w:t>
+            </w:r>
+            <w:proofErr w:type="spellEnd"/>
+            <w:r>
+              <w:t xml:space="preserve"> </w:t>
+            </w:r>
+            <w:proofErr w:type="spellStart"/>
+            <w:r>
+              <w:t>tải</w:t>
+            </w:r>
+            <w:proofErr w:type="spellEnd"/>
+            <w:r>
+              <w:t xml:space="preserve"> </w:t>
+            </w:r>
+            <w:proofErr w:type="spellStart"/>
+            <w:r>
+              <w:t>xuống</w:t>
+            </w:r>
+            <w:proofErr w:type="spellEnd"/>
+            <w:r>
+              <w:t xml:space="preserve"> </w:t>
+            </w:r>
+            <w:proofErr w:type="spellStart"/>
+            <w:r>
+              <w:t>vaoof</w:t>
+            </w:r>
+            <w:proofErr w:type="spellEnd"/>
+            <w:r>
+              <w:t xml:space="preserve"> </w:t>
+            </w:r>
+            <w:proofErr w:type="spellStart"/>
+            <w:r>
+              <w:t>cột</w:t>
+            </w:r>
+            <w:proofErr w:type="spellEnd"/>
+            <w:r>
+              <w:t xml:space="preserve"> file, </w:t>
+            </w:r>
+            <w:proofErr w:type="spellStart"/>
+            <w:r>
+              <w:t>thêm</w:t>
+            </w:r>
+            <w:proofErr w:type="spellEnd"/>
+            <w:r>
+              <w:t xml:space="preserve"> 1 </w:t>
+            </w:r>
+            <w:proofErr w:type="spellStart"/>
+            <w:r>
+              <w:t>nút</w:t>
+            </w:r>
+            <w:proofErr w:type="spellEnd"/>
+            <w:r>
+              <w:t xml:space="preserve"> publish </w:t>
+            </w:r>
+            <w:proofErr w:type="spellStart"/>
+            <w:r>
+              <w:t>vào</w:t>
+            </w:r>
+            <w:proofErr w:type="spellEnd"/>
+            <w:r>
+              <w:t xml:space="preserve"> </w:t>
+            </w:r>
+            <w:proofErr w:type="spellStart"/>
+            <w:r>
+              <w:t>cột</w:t>
+            </w:r>
+            <w:proofErr w:type="spellEnd"/>
+            <w:r>
+              <w:t xml:space="preserve"> </w:t>
+            </w:r>
+            <w:proofErr w:type="spellStart"/>
+            <w:r>
+              <w:t>trạng</w:t>
+            </w:r>
+            <w:proofErr w:type="spellEnd"/>
+            <w:r>
+              <w:t xml:space="preserve"> </w:t>
+            </w:r>
+            <w:proofErr w:type="spellStart"/>
+            <w:r>
+              <w:t>thái</w:t>
+            </w:r>
+            <w:proofErr w:type="spellEnd"/>
+          </w:p>
+          <w:p>
+            <w:pPr>
+              <w:pStyle w:val="ListParagraph"/>
+            </w:pPr>
+          </w:p>
+        </w:tc>
+        <w:tc>
+          <w:tcPr>
+            <w:tcW w:w="1989" w:type="dxa"/>
+          </w:tcPr>
+          <w:p/>
+        </w:tc>
+        <w:tc>
+          <w:tcPr>
+            <w:tcW w:w="1440" w:type="dxa"/>
+          </w:tcPr>
+          <w:p/>
+        </w:tc>
+      </w:tr>
+      <w:tr>
+        <w:tc>
+          <w:tcPr>
+            <w:tcW w:w="738" w:type="dxa"/>
+          </w:tcPr>
+          <w:p>
+            <w:pPr>
+              <w:pStyle w:val="ListParagraph"/>
+              <w:numPr>
+                <w:ilvl w:val="0"/>
+                <w:numId w:val="3"/>
+              </w:numPr>
+            </w:pPr>
+          </w:p>
+        </w:tc>
+        <w:tc>
+          <w:tcPr>
+            <w:tcW w:w="6268" w:type="dxa"/>
+          </w:tcPr>
+          <w:p>
+            <w:pPr>
+              <w:pStyle w:val="ListParagraph"/>
+            </w:pPr>
+            <w:proofErr w:type="spellStart"/>
+            <w:r>
+              <w:t>Khi</w:t>
+            </w:r>
+            <w:proofErr w:type="spellEnd"/>
+            <w:r>
+              <w:t xml:space="preserve"> </w:t>
+            </w:r>
+            <w:proofErr w:type="spellStart"/>
+            <w:r>
+              <w:t>thêm</w:t>
+            </w:r>
+            <w:proofErr w:type="spellEnd"/>
+            <w:r>
+              <w:t xml:space="preserve"> </w:t>
+            </w:r>
+            <w:proofErr w:type="spellStart"/>
+            <w:r>
+              <w:t>lớp</w:t>
+            </w:r>
+            <w:proofErr w:type="spellEnd"/>
+            <w:r>
+              <w:t xml:space="preserve"> </w:t>
+            </w:r>
+            <w:proofErr w:type="spellStart"/>
+            <w:r>
+              <w:t>ảo</w:t>
+            </w:r>
+            <w:proofErr w:type="spellEnd"/>
+            <w:r>
+              <w:t xml:space="preserve"> </w:t>
+            </w:r>
+            <w:proofErr w:type="spellStart"/>
+            <w:r>
+              <w:t>thì</w:t>
+            </w:r>
+            <w:proofErr w:type="spellEnd"/>
+            <w:r>
+              <w:t xml:space="preserve"> </w:t>
+            </w:r>
+            <w:proofErr w:type="spellStart"/>
+            <w:r>
+              <w:t>khi</w:t>
+            </w:r>
+            <w:proofErr w:type="spellEnd"/>
+            <w:r>
+              <w:t xml:space="preserve"> </w:t>
+            </w:r>
+            <w:proofErr w:type="spellStart"/>
+            <w:r>
+              <w:t>sửa,phải</w:t>
+            </w:r>
+            <w:proofErr w:type="spellEnd"/>
+            <w:r>
+              <w:t xml:space="preserve"> </w:t>
+            </w:r>
+            <w:proofErr w:type="spellStart"/>
+            <w:r>
+              <w:t>giữ</w:t>
+            </w:r>
+            <w:proofErr w:type="spellEnd"/>
+            <w:r>
+              <w:t xml:space="preserve"> </w:t>
+            </w:r>
+            <w:proofErr w:type="spellStart"/>
+            <w:r>
+              <w:t>trạng</w:t>
+            </w:r>
+            <w:proofErr w:type="spellEnd"/>
+            <w:r>
+              <w:t xml:space="preserve"> </w:t>
+            </w:r>
+            <w:proofErr w:type="spellStart"/>
+            <w:r>
+              <w:t>thái</w:t>
+            </w:r>
+            <w:proofErr w:type="spellEnd"/>
+            <w:r>
+              <w:t xml:space="preserve"> </w:t>
+            </w:r>
+            <w:proofErr w:type="spellStart"/>
+            <w:r>
+              <w:t>của</w:t>
+            </w:r>
+            <w:proofErr w:type="spellEnd"/>
+            <w:r>
+              <w:t xml:space="preserve"> </w:t>
+            </w:r>
+            <w:proofErr w:type="spellStart"/>
+            <w:r>
+              <w:t>lớp</w:t>
+            </w:r>
+            <w:proofErr w:type="spellEnd"/>
+            <w:r>
+              <w:t xml:space="preserve">, </w:t>
+            </w:r>
+            <w:proofErr w:type="spellStart"/>
+            <w:r>
+              <w:t>môn</w:t>
+            </w:r>
+            <w:proofErr w:type="spellEnd"/>
+            <w:r>
+              <w:t xml:space="preserve"> </w:t>
+            </w:r>
+            <w:proofErr w:type="spellStart"/>
+            <w:r>
+              <w:t>học</w:t>
+            </w:r>
+            <w:proofErr w:type="spellEnd"/>
+          </w:p>
+          <w:p>
+            <w:pPr>
+              <w:pStyle w:val="ListParagraph"/>
+            </w:pPr>
+          </w:p>
+        </w:tc>
+        <w:tc>
+          <w:tcPr>
+            <w:tcW w:w="1989" w:type="dxa"/>
+          </w:tcPr>
+          <w:p/>
+        </w:tc>
+        <w:tc>
+          <w:tcPr>
+            <w:tcW w:w="1440" w:type="dxa"/>
+          </w:tcPr>
+          <w:p/>
+        </w:tc>
+      </w:tr>
+      <w:tr>
+        <w:tc>
+          <w:tcPr>
+            <w:tcW w:w="738" w:type="dxa"/>
+          </w:tcPr>
+          <w:p>
+            <w:pPr>
+              <w:pStyle w:val="ListParagraph"/>
+              <w:numPr>
+                <w:ilvl w:val="0"/>
+                <w:numId w:val="3"/>
+              </w:numPr>
+            </w:pPr>
+          </w:p>
+        </w:tc>
+        <w:tc>
+          <w:tcPr>
+            <w:tcW w:w="6268" w:type="dxa"/>
+          </w:tcPr>
+          <w:p>
+            <w:pPr>
+              <w:pStyle w:val="ListParagraph"/>
+            </w:pPr>
+            <w:proofErr w:type="spellStart"/>
+            <w:r>
+              <w:t>Phải</w:t>
+            </w:r>
+            <w:proofErr w:type="spellEnd"/>
+            <w:r>
+              <w:t xml:space="preserve"> check </w:t>
+            </w:r>
+            <w:proofErr w:type="spellStart"/>
+            <w:r>
+              <w:t>không</w:t>
+            </w:r>
+            <w:proofErr w:type="spellEnd"/>
+            <w:r>
+              <w:t xml:space="preserve"> </w:t>
+            </w:r>
+            <w:proofErr w:type="spellStart"/>
+            <w:r>
+              <w:t>cho</w:t>
+            </w:r>
+            <w:proofErr w:type="spellEnd"/>
+            <w:r>
+              <w:t xml:space="preserve"> 1 </w:t>
+            </w:r>
+            <w:proofErr w:type="spellStart"/>
+            <w:r>
+              <w:t>ông</w:t>
+            </w:r>
+            <w:proofErr w:type="spellEnd"/>
+            <w:r>
+              <w:t xml:space="preserve"> </w:t>
+            </w:r>
+            <w:proofErr w:type="spellStart"/>
+            <w:r>
+              <w:t>giáo</w:t>
+            </w:r>
+            <w:proofErr w:type="spellEnd"/>
+            <w:r>
+              <w:t xml:space="preserve"> </w:t>
+            </w:r>
+            <w:proofErr w:type="spellStart"/>
+            <w:r>
+              <w:t>viên</w:t>
+            </w:r>
+            <w:proofErr w:type="spellEnd"/>
+            <w:r>
+              <w:t xml:space="preserve">  </w:t>
+            </w:r>
+            <w:proofErr w:type="spellStart"/>
+            <w:r>
+              <w:t>tạo</w:t>
+            </w:r>
+            <w:proofErr w:type="spellEnd"/>
+            <w:r>
+              <w:t xml:space="preserve"> 2 </w:t>
+            </w:r>
+            <w:proofErr w:type="spellStart"/>
+            <w:r>
+              <w:t>lớp</w:t>
+            </w:r>
+            <w:proofErr w:type="spellEnd"/>
+            <w:r>
+              <w:t xml:space="preserve"> y </w:t>
+            </w:r>
+            <w:proofErr w:type="spellStart"/>
+            <w:r>
+              <w:t>chang</w:t>
+            </w:r>
+            <w:proofErr w:type="spellEnd"/>
+            <w:r>
+              <w:t xml:space="preserve"> </w:t>
+            </w:r>
+            <w:proofErr w:type="spellStart"/>
+            <w:r>
+              <w:t>nhau</w:t>
+            </w:r>
+            <w:proofErr w:type="spellEnd"/>
+            <w:r>
+              <w:t>(</w:t>
+            </w:r>
+            <w:proofErr w:type="spellStart"/>
+            <w:r>
+              <w:t>cùng</w:t>
+            </w:r>
+            <w:proofErr w:type="spellEnd"/>
+            <w:r>
+              <w:t xml:space="preserve">  </w:t>
+            </w:r>
+            <w:proofErr w:type="spellStart"/>
+            <w:r>
+              <w:t>lớp,cùng</w:t>
+            </w:r>
+            <w:proofErr w:type="spellEnd"/>
+            <w:r>
+              <w:t xml:space="preserve"> </w:t>
+            </w:r>
+            <w:proofErr w:type="spellStart"/>
+            <w:r>
+              <w:t>giờ</w:t>
+            </w:r>
+            <w:proofErr w:type="spellEnd"/>
+            <w:r>
+              <w:t>)</w:t>
+            </w:r>
+          </w:p>
+          <w:p>
+            <w:pPr>
+              <w:pStyle w:val="ListParagraph"/>
+            </w:pPr>
+          </w:p>
+        </w:tc>
+        <w:tc>
+          <w:tcPr>
+            <w:tcW w:w="1989" w:type="dxa"/>
+          </w:tcPr>
+          <w:p/>
+        </w:tc>
+        <w:tc>
+          <w:tcPr>
+            <w:tcW w:w="1440" w:type="dxa"/>
+          </w:tcPr>
+          <w:p/>
+        </w:tc>
+      </w:tr>
+      <w:tr>
+        <w:tc>
+          <w:tcPr>
+            <w:tcW w:w="738" w:type="dxa"/>
+          </w:tcPr>
+          <w:p>
+            <w:pPr>
+              <w:pStyle w:val="ListParagraph"/>
+              <w:numPr>
+                <w:ilvl w:val="0"/>
+                <w:numId w:val="3"/>
+              </w:numPr>
+            </w:pPr>
+          </w:p>
+        </w:tc>
+        <w:tc>
+          <w:tcPr>
+            <w:tcW w:w="6268" w:type="dxa"/>
+          </w:tcPr>
+          <w:p>
+            <w:pPr>
+              <w:pStyle w:val="ListParagraph"/>
+            </w:pPr>
+            <w:proofErr w:type="spellStart"/>
+            <w:r>
+              <w:t>Khi</w:t>
+            </w:r>
+            <w:proofErr w:type="spellEnd"/>
+            <w:r>
+              <w:t xml:space="preserve"> </w:t>
+            </w:r>
+            <w:proofErr w:type="spellStart"/>
+            <w:r>
+              <w:t>tạo</w:t>
+            </w:r>
+            <w:proofErr w:type="spellEnd"/>
+            <w:r>
+              <w:t xml:space="preserve"> </w:t>
+            </w:r>
+            <w:proofErr w:type="spellStart"/>
+            <w:r>
+              <w:t>lớp</w:t>
+            </w:r>
+            <w:proofErr w:type="spellEnd"/>
+            <w:r>
+              <w:t xml:space="preserve"> start &lt; end </w:t>
+            </w:r>
+            <w:proofErr w:type="spellStart"/>
+            <w:r>
+              <w:t>thì</w:t>
+            </w:r>
+            <w:proofErr w:type="spellEnd"/>
+            <w:r>
+              <w:t xml:space="preserve"> </w:t>
+            </w:r>
+            <w:proofErr w:type="spellStart"/>
+            <w:r>
+              <w:t>phải</w:t>
+            </w:r>
+            <w:proofErr w:type="spellEnd"/>
+            <w:r>
+              <w:t xml:space="preserve"> </w:t>
+            </w:r>
+            <w:proofErr w:type="spellStart"/>
+            <w:r>
+              <w:t>hiện</w:t>
+            </w:r>
+            <w:proofErr w:type="spellEnd"/>
+            <w:r>
+              <w:t xml:space="preserve"> </w:t>
+            </w:r>
+            <w:proofErr w:type="spellStart"/>
+            <w:r>
+              <w:t>ra</w:t>
+            </w:r>
+            <w:proofErr w:type="spellEnd"/>
+            <w:r>
+              <w:t xml:space="preserve"> </w:t>
+            </w:r>
+            <w:proofErr w:type="spellStart"/>
+            <w:r>
+              <w:t>lỗi</w:t>
+            </w:r>
+            <w:proofErr w:type="spellEnd"/>
+          </w:p>
+          <w:p>
+            <w:pPr>
+              <w:pStyle w:val="ListParagraph"/>
+            </w:pPr>
+          </w:p>
+        </w:tc>
+        <w:tc>
+          <w:tcPr>
+            <w:tcW w:w="1989" w:type="dxa"/>
+          </w:tcPr>
+          <w:p/>
+        </w:tc>
+        <w:tc>
+          <w:tcPr>
+            <w:tcW w:w="1440" w:type="dxa"/>
+          </w:tcPr>
+          <w:p/>
+        </w:tc>
+      </w:tr>
+    </w:tbl>
     <w:p/>
-    <w:p>
-      <w:pPr>
-        <w:pStyle w:val="ListParagraph"/>
-        <w:numPr>
-          <w:ilvl w:val="0"/>
-          <w:numId w:val="2"/>
-        </w:numPr>
-      </w:pPr>
-      <w:r>
-        <w:t xml:space="preserve">Gmail </w:t>
-      </w:r>
-      <w:proofErr w:type="spellStart"/>
-      <w:r>
-        <w:t>phải</w:t>
-      </w:r>
-      <w:proofErr w:type="spellEnd"/>
-      <w:r>
-        <w:t xml:space="preserve"> check </w:t>
-      </w:r>
-      <w:proofErr w:type="spellStart"/>
-      <w:r>
-        <w:t>có</w:t>
-      </w:r>
-      <w:proofErr w:type="spellEnd"/>
-      <w:r>
-        <w:t xml:space="preserve"> </w:t>
-      </w:r>
-      <w:proofErr w:type="spellStart"/>
-      <w:r>
-        <w:t>phải</w:t>
-      </w:r>
-      <w:proofErr w:type="spellEnd"/>
-      <w:r>
-        <w:t xml:space="preserve"> </w:t>
-      </w:r>
-      <w:proofErr w:type="spellStart"/>
-      <w:r>
-        <w:t>gmail</w:t>
-      </w:r>
-      <w:proofErr w:type="spellEnd"/>
-      <w:r>
-        <w:t xml:space="preserve"> </w:t>
-      </w:r>
-      <w:proofErr w:type="spellStart"/>
-      <w:r>
-        <w:t>không</w:t>
-      </w:r>
-      <w:proofErr w:type="spellEnd"/>
-    </w:p>
-    <w:p>
-      <w:pPr>
-        <w:pStyle w:val="ListParagraph"/>
-        <w:numPr>
-          <w:ilvl w:val="0"/>
-          <w:numId w:val="2"/>
-        </w:numPr>
-      </w:pPr>
-      <w:r>
-        <w:t xml:space="preserve">SDT </w:t>
-      </w:r>
-      <w:proofErr w:type="spellStart"/>
-      <w:r>
-        <w:t>phải</w:t>
-      </w:r>
-      <w:proofErr w:type="spellEnd"/>
-      <w:r>
-        <w:t xml:space="preserve"> check</w:t>
-      </w:r>
-    </w:p>
-    <w:p>
-      <w:pPr>
-        <w:pStyle w:val="ListParagraph"/>
-        <w:numPr>
-          <w:ilvl w:val="0"/>
-          <w:numId w:val="2"/>
-        </w:numPr>
-      </w:pPr>
-      <w:proofErr w:type="spellStart"/>
-      <w:r>
-        <w:t>Tìm</w:t>
-      </w:r>
-      <w:proofErr w:type="spellEnd"/>
-      <w:r>
-        <w:t xml:space="preserve"> </w:t>
-      </w:r>
-      <w:proofErr w:type="spellStart"/>
-      <w:r>
-        <w:t>thư</w:t>
-      </w:r>
-      <w:proofErr w:type="spellEnd"/>
-      <w:r>
-        <w:t xml:space="preserve"> </w:t>
-      </w:r>
-      <w:proofErr w:type="spellStart"/>
-      <w:r>
-        <w:t>viện</w:t>
-      </w:r>
-      <w:proofErr w:type="spellEnd"/>
-      <w:r>
-        <w:t xml:space="preserve"> check </w:t>
-      </w:r>
-      <w:proofErr w:type="spellStart"/>
-      <w:r>
-        <w:t>chỗ</w:t>
-      </w:r>
-      <w:proofErr w:type="spellEnd"/>
-      <w:r>
-        <w:t xml:space="preserve"> </w:t>
-      </w:r>
-      <w:proofErr w:type="spellStart"/>
-      <w:r>
-        <w:t>nào</w:t>
-      </w:r>
-      <w:proofErr w:type="spellEnd"/>
-      <w:r>
-        <w:t xml:space="preserve"> </w:t>
-      </w:r>
-      <w:proofErr w:type="spellStart"/>
-      <w:r>
-        <w:t>lỗi</w:t>
-      </w:r>
-      <w:proofErr w:type="spellEnd"/>
-      <w:r>
-        <w:t xml:space="preserve"> </w:t>
-      </w:r>
-      <w:proofErr w:type="spellStart"/>
-      <w:r>
-        <w:t>thì</w:t>
-      </w:r>
-      <w:proofErr w:type="spellEnd"/>
-      <w:r>
-        <w:t xml:space="preserve"> </w:t>
-      </w:r>
-      <w:proofErr w:type="spellStart"/>
-      <w:r>
-        <w:t>tô</w:t>
-      </w:r>
-      <w:proofErr w:type="spellEnd"/>
-      <w:r>
-        <w:t xml:space="preserve"> </w:t>
-      </w:r>
-      <w:proofErr w:type="spellStart"/>
-      <w:r>
-        <w:t>đỏ</w:t>
-      </w:r>
-      <w:proofErr w:type="spellEnd"/>
-      <w:r>
-        <w:t xml:space="preserve"> </w:t>
-      </w:r>
-      <w:proofErr w:type="spellStart"/>
-      <w:r>
-        <w:t>lên</w:t>
-      </w:r>
-      <w:proofErr w:type="spellEnd"/>
-    </w:p>
-    <w:p>
-      <w:pPr>
-        <w:pStyle w:val="ListParagraph"/>
-        <w:numPr>
-          <w:ilvl w:val="0"/>
-          <w:numId w:val="2"/>
-        </w:numPr>
-      </w:pPr>
-      <w:proofErr w:type="spellStart"/>
-      <w:r>
-        <w:t>Trang</w:t>
-      </w:r>
-      <w:proofErr w:type="spellEnd"/>
-      <w:r>
-        <w:t xml:space="preserve"> </w:t>
-      </w:r>
-      <w:proofErr w:type="spellStart"/>
-      <w:r>
-        <w:t>myinfor</w:t>
-      </w:r>
-      <w:proofErr w:type="spellEnd"/>
-      <w:r>
-        <w:t>(</w:t>
-      </w:r>
-      <w:proofErr w:type="spellStart"/>
-      <w:r>
-        <w:t>khi</w:t>
-      </w:r>
-      <w:proofErr w:type="spellEnd"/>
-      <w:r>
-        <w:t xml:space="preserve"> </w:t>
-      </w:r>
-      <w:proofErr w:type="spellStart"/>
-      <w:r>
-        <w:t>sửa</w:t>
-      </w:r>
-      <w:proofErr w:type="spellEnd"/>
-      <w:r>
-        <w:t xml:space="preserve"> </w:t>
-      </w:r>
-      <w:proofErr w:type="spellStart"/>
-      <w:r>
-        <w:t>sđt</w:t>
-      </w:r>
-      <w:proofErr w:type="spellEnd"/>
-      <w:r>
-        <w:t xml:space="preserve">, </w:t>
-      </w:r>
-      <w:proofErr w:type="spellStart"/>
-      <w:r>
-        <w:t>gmail</w:t>
-      </w:r>
-      <w:proofErr w:type="spellEnd"/>
-      <w:r>
-        <w:t xml:space="preserve"> </w:t>
-      </w:r>
-      <w:proofErr w:type="spellStart"/>
-      <w:r>
-        <w:t>thì</w:t>
-      </w:r>
-      <w:proofErr w:type="spellEnd"/>
-      <w:r>
-        <w:t xml:space="preserve"> </w:t>
-      </w:r>
-      <w:proofErr w:type="spellStart"/>
-      <w:r>
-        <w:t>lỗi</w:t>
-      </w:r>
-      <w:proofErr w:type="spellEnd"/>
-      <w:r>
-        <w:t>)</w:t>
-      </w:r>
-      <w:r>
-        <w:t xml:space="preserve">, reload page </w:t>
-      </w:r>
-      <w:proofErr w:type="spellStart"/>
-      <w:r>
-        <w:t>sẽ</w:t>
-      </w:r>
-      <w:proofErr w:type="spellEnd"/>
-      <w:r>
-        <w:t xml:space="preserve"> </w:t>
-      </w:r>
-      <w:proofErr w:type="spellStart"/>
-      <w:r>
-        <w:t>ra</w:t>
-      </w:r>
-      <w:proofErr w:type="spellEnd"/>
-      <w:r>
-        <w:t xml:space="preserve"> </w:t>
-      </w:r>
-      <w:proofErr w:type="spellStart"/>
-      <w:r>
-        <w:t>lỗi</w:t>
-      </w:r>
-      <w:proofErr w:type="spellEnd"/>
-      <w:r>
-        <w:t xml:space="preserve"> exception</w:t>
-      </w:r>
-    </w:p>
-    <w:p>
-      <w:pPr>
-        <w:pStyle w:val="ListParagraph"/>
-        <w:numPr>
-          <w:ilvl w:val="0"/>
-          <w:numId w:val="2"/>
-        </w:numPr>
-      </w:pPr>
-      <w:proofErr w:type="spellStart"/>
-      <w:r>
-        <w:t>Chỉnh</w:t>
-      </w:r>
-      <w:proofErr w:type="spellEnd"/>
-      <w:r>
-        <w:t xml:space="preserve"> </w:t>
-      </w:r>
-      <w:proofErr w:type="spellStart"/>
-      <w:r>
-        <w:t>cách</w:t>
-      </w:r>
-      <w:proofErr w:type="spellEnd"/>
-      <w:r>
-        <w:t xml:space="preserve"> </w:t>
-      </w:r>
-      <w:proofErr w:type="spellStart"/>
-      <w:r>
-        <w:t>Hiện</w:t>
-      </w:r>
-      <w:proofErr w:type="spellEnd"/>
-      <w:r>
-        <w:t xml:space="preserve"> exception</w:t>
-      </w:r>
-      <w:r>
-        <w:t>(</w:t>
-      </w:r>
-      <w:proofErr w:type="spellStart"/>
-      <w:r>
-        <w:t>không</w:t>
-      </w:r>
-      <w:proofErr w:type="spellEnd"/>
-      <w:r>
-        <w:t xml:space="preserve"> </w:t>
-      </w:r>
-      <w:proofErr w:type="spellStart"/>
-      <w:r>
-        <w:t>hiện</w:t>
-      </w:r>
-      <w:proofErr w:type="spellEnd"/>
-      <w:r>
-        <w:t xml:space="preserve"> </w:t>
-      </w:r>
-      <w:proofErr w:type="spellStart"/>
-      <w:r>
-        <w:t>khi</w:t>
-      </w:r>
-      <w:proofErr w:type="spellEnd"/>
-      <w:r>
-        <w:t xml:space="preserve"> bay </w:t>
-      </w:r>
-      <w:proofErr w:type="spellStart"/>
-      <w:r>
-        <w:t>vào</w:t>
-      </w:r>
-      <w:proofErr w:type="spellEnd"/>
-      <w:r>
-        <w:t xml:space="preserve"> backend </w:t>
-      </w:r>
-      <w:proofErr w:type="spellStart"/>
-      <w:r>
-        <w:t>nữa</w:t>
-      </w:r>
-      <w:proofErr w:type="spellEnd"/>
-      <w:r>
-        <w:t>)</w:t>
-      </w:r>
-    </w:p>
-    <w:p>
-      <w:pPr>
-        <w:pStyle w:val="ListParagraph"/>
-        <w:numPr>
-          <w:ilvl w:val="0"/>
-          <w:numId w:val="2"/>
-        </w:numPr>
-      </w:pPr>
-      <w:proofErr w:type="spellStart"/>
-      <w:r>
-        <w:t>Khi</w:t>
-      </w:r>
-      <w:proofErr w:type="spellEnd"/>
-      <w:r>
-        <w:t xml:space="preserve"> </w:t>
-      </w:r>
-      <w:proofErr w:type="spellStart"/>
-      <w:r>
-        <w:t>sửa</w:t>
-      </w:r>
-      <w:proofErr w:type="spellEnd"/>
-      <w:r>
-        <w:t xml:space="preserve"> lesson(file lesson </w:t>
-      </w:r>
-      <w:proofErr w:type="spellStart"/>
-      <w:r>
-        <w:t>phải</w:t>
-      </w:r>
-      <w:proofErr w:type="spellEnd"/>
-      <w:r>
-        <w:t xml:space="preserve"> </w:t>
-      </w:r>
-      <w:proofErr w:type="spellStart"/>
-      <w:r>
-        <w:t>còn</w:t>
-      </w:r>
-      <w:proofErr w:type="spellEnd"/>
-      <w:r>
-        <w:t xml:space="preserve">, </w:t>
-      </w:r>
-      <w:proofErr w:type="spellStart"/>
-      <w:r>
-        <w:t>không</w:t>
-      </w:r>
-      <w:proofErr w:type="spellEnd"/>
-      <w:r>
-        <w:t xml:space="preserve"> </w:t>
-      </w:r>
-      <w:proofErr w:type="spellStart"/>
-      <w:r>
-        <w:t>bị</w:t>
-      </w:r>
-      <w:proofErr w:type="spellEnd"/>
-      <w:r>
-        <w:t xml:space="preserve"> </w:t>
-      </w:r>
-      <w:proofErr w:type="spellStart"/>
-      <w:r>
-        <w:t>trôi</w:t>
-      </w:r>
-      <w:proofErr w:type="spellEnd"/>
-      <w:r>
-        <w:t>)</w:t>
-      </w:r>
-    </w:p>
-    <w:p>
-      <w:pPr>
-        <w:pStyle w:val="ListParagraph"/>
-        <w:numPr>
-          <w:ilvl w:val="0"/>
-          <w:numId w:val="2"/>
-        </w:numPr>
-      </w:pPr>
-      <w:proofErr w:type="spellStart"/>
-      <w:r>
-        <w:t>Tìm</w:t>
-      </w:r>
-      <w:proofErr w:type="spellEnd"/>
-      <w:r>
-        <w:t xml:space="preserve"> </w:t>
-      </w:r>
-      <w:proofErr w:type="spellStart"/>
-      <w:r>
-        <w:t>thư</w:t>
-      </w:r>
-      <w:proofErr w:type="spellEnd"/>
-      <w:r>
-        <w:t xml:space="preserve"> </w:t>
-      </w:r>
-      <w:proofErr w:type="spellStart"/>
-      <w:r>
-        <w:t>viện</w:t>
-      </w:r>
-      <w:proofErr w:type="spellEnd"/>
-      <w:r>
-        <w:t xml:space="preserve"> </w:t>
-      </w:r>
-      <w:proofErr w:type="spellStart"/>
-      <w:r>
-        <w:t>dùng</w:t>
-      </w:r>
-      <w:proofErr w:type="spellEnd"/>
-      <w:r>
-        <w:t xml:space="preserve"> </w:t>
-      </w:r>
-      <w:proofErr w:type="spellStart"/>
-      <w:r>
-        <w:t>để</w:t>
-      </w:r>
-      <w:proofErr w:type="spellEnd"/>
-      <w:r>
-        <w:t xml:space="preserve"> sort </w:t>
-      </w:r>
-      <w:proofErr w:type="spellStart"/>
-      <w:r>
-        <w:t>các</w:t>
-      </w:r>
-      <w:proofErr w:type="spellEnd"/>
-      <w:r>
-        <w:t xml:space="preserve"> lesson</w:t>
-      </w:r>
-    </w:p>
-    <w:p>
-      <w:pPr>
-        <w:pStyle w:val="ListParagraph"/>
-        <w:numPr>
-          <w:ilvl w:val="0"/>
-          <w:numId w:val="2"/>
-        </w:numPr>
-      </w:pPr>
-      <w:proofErr w:type="spellStart"/>
-      <w:r>
-        <w:t>Phân</w:t>
-      </w:r>
-      <w:proofErr w:type="spellEnd"/>
-      <w:r>
-        <w:t xml:space="preserve"> </w:t>
-      </w:r>
-      <w:proofErr w:type="spellStart"/>
-      <w:r>
-        <w:t>trang</w:t>
-      </w:r>
-      <w:proofErr w:type="spellEnd"/>
-      <w:r>
-        <w:t xml:space="preserve"> </w:t>
-      </w:r>
-      <w:proofErr w:type="spellStart"/>
-      <w:r>
-        <w:t>cho</w:t>
-      </w:r>
-      <w:proofErr w:type="spellEnd"/>
-      <w:r>
-        <w:t xml:space="preserve"> lesson, virtual class</w:t>
-      </w:r>
-      <w:r>
-        <w:t>(</w:t>
-      </w:r>
-      <w:proofErr w:type="spellStart"/>
-      <w:r>
-        <w:t>cho</w:t>
-      </w:r>
-      <w:proofErr w:type="spellEnd"/>
-      <w:r>
-        <w:t xml:space="preserve"> </w:t>
-      </w:r>
-      <w:proofErr w:type="spellStart"/>
-      <w:r>
-        <w:t>cả</w:t>
-      </w:r>
-      <w:proofErr w:type="spellEnd"/>
-      <w:r>
-        <w:t xml:space="preserve"> student </w:t>
-      </w:r>
-      <w:proofErr w:type="spellStart"/>
-      <w:r>
-        <w:t>và</w:t>
-      </w:r>
-      <w:proofErr w:type="spellEnd"/>
-      <w:r>
-        <w:t xml:space="preserve"> teacher)</w:t>
-      </w:r>
-    </w:p>
-    <w:p>
-      <w:pPr>
-        <w:pStyle w:val="ListParagraph"/>
-        <w:numPr>
-          <w:ilvl w:val="0"/>
-          <w:numId w:val="2"/>
-        </w:numPr>
-      </w:pPr>
-      <w:r>
-        <w:t xml:space="preserve">Check </w:t>
-      </w:r>
-      <w:proofErr w:type="spellStart"/>
-      <w:r>
-        <w:t>không</w:t>
-      </w:r>
-      <w:proofErr w:type="spellEnd"/>
-      <w:r>
-        <w:t xml:space="preserve"> </w:t>
-      </w:r>
-      <w:proofErr w:type="spellStart"/>
-      <w:r>
-        <w:t>cho</w:t>
-      </w:r>
-      <w:proofErr w:type="spellEnd"/>
-      <w:r>
-        <w:t xml:space="preserve"> </w:t>
-      </w:r>
-      <w:proofErr w:type="spellStart"/>
-      <w:r>
-        <w:t>giáo</w:t>
-      </w:r>
-      <w:proofErr w:type="spellEnd"/>
-      <w:r>
-        <w:t xml:space="preserve"> </w:t>
-      </w:r>
-      <w:proofErr w:type="spellStart"/>
-      <w:r>
-        <w:t>viên</w:t>
-      </w:r>
-      <w:proofErr w:type="spellEnd"/>
-      <w:r>
-        <w:t xml:space="preserve"> </w:t>
-      </w:r>
-      <w:proofErr w:type="spellStart"/>
-      <w:r>
-        <w:t>tạo</w:t>
-      </w:r>
-      <w:proofErr w:type="spellEnd"/>
-      <w:r>
-        <w:t xml:space="preserve"> 2 </w:t>
-      </w:r>
-      <w:proofErr w:type="spellStart"/>
-      <w:r>
-        <w:t>bài</w:t>
-      </w:r>
-      <w:proofErr w:type="spellEnd"/>
-      <w:r>
-        <w:t xml:space="preserve"> y </w:t>
-      </w:r>
-      <w:proofErr w:type="spellStart"/>
-      <w:r>
-        <w:t>chang</w:t>
-      </w:r>
-      <w:proofErr w:type="spellEnd"/>
-      <w:r>
-        <w:t xml:space="preserve"> </w:t>
-      </w:r>
-      <w:proofErr w:type="spellStart"/>
-      <w:r>
-        <w:t>nhau</w:t>
-      </w:r>
-      <w:proofErr w:type="spellEnd"/>
-      <w:r>
-        <w:t>(</w:t>
-      </w:r>
-      <w:proofErr w:type="spellStart"/>
-      <w:r>
-        <w:t>dựa</w:t>
-      </w:r>
-      <w:proofErr w:type="spellEnd"/>
-      <w:r>
-        <w:t xml:space="preserve"> </w:t>
-      </w:r>
-      <w:proofErr w:type="spellStart"/>
-      <w:r>
-        <w:t>theo</w:t>
-      </w:r>
-      <w:proofErr w:type="spellEnd"/>
-      <w:r>
-        <w:t xml:space="preserve"> </w:t>
-      </w:r>
-      <w:proofErr w:type="spellStart"/>
-      <w:r>
-        <w:t>cột</w:t>
-      </w:r>
-      <w:proofErr w:type="spellEnd"/>
-      <w:r>
-        <w:t xml:space="preserve"> </w:t>
-      </w:r>
-      <w:proofErr w:type="spellStart"/>
-      <w:r>
-        <w:t>tên</w:t>
-      </w:r>
-      <w:proofErr w:type="spellEnd"/>
-      <w:r>
-        <w:t>)</w:t>
-      </w:r>
-    </w:p>
-    <w:p>
-      <w:pPr>
-        <w:pStyle w:val="ListParagraph"/>
-        <w:numPr>
-          <w:ilvl w:val="0"/>
-          <w:numId w:val="2"/>
-        </w:numPr>
-      </w:pPr>
-      <w:proofErr w:type="spellStart"/>
-      <w:r>
-        <w:lastRenderedPageBreak/>
-        <w:t>Đưa</w:t>
-      </w:r>
-      <w:proofErr w:type="spellEnd"/>
-      <w:r>
-        <w:t xml:space="preserve"> </w:t>
-      </w:r>
-      <w:proofErr w:type="spellStart"/>
-      <w:r>
-        <w:t>nút</w:t>
-      </w:r>
-      <w:proofErr w:type="spellEnd"/>
-      <w:r>
-        <w:t xml:space="preserve"> </w:t>
-      </w:r>
-      <w:proofErr w:type="spellStart"/>
-      <w:r>
-        <w:t>tải</w:t>
-      </w:r>
-      <w:proofErr w:type="spellEnd"/>
-      <w:r>
-        <w:t xml:space="preserve"> </w:t>
-      </w:r>
-      <w:proofErr w:type="spellStart"/>
-      <w:r>
-        <w:t>xuống</w:t>
-      </w:r>
-      <w:proofErr w:type="spellEnd"/>
-      <w:r>
-        <w:t xml:space="preserve"> </w:t>
-      </w:r>
-      <w:proofErr w:type="spellStart"/>
-      <w:r>
-        <w:t>vaoof</w:t>
-      </w:r>
-      <w:proofErr w:type="spellEnd"/>
-      <w:r>
-        <w:t xml:space="preserve"> </w:t>
-      </w:r>
-      <w:proofErr w:type="spellStart"/>
-      <w:r>
-        <w:t>cột</w:t>
-      </w:r>
-      <w:proofErr w:type="spellEnd"/>
-      <w:r>
-        <w:t xml:space="preserve"> file, </w:t>
-      </w:r>
-      <w:proofErr w:type="spellStart"/>
-      <w:r>
-        <w:t>thêm</w:t>
-      </w:r>
-      <w:proofErr w:type="spellEnd"/>
-      <w:r>
-        <w:t xml:space="preserve"> 1 </w:t>
-      </w:r>
-      <w:proofErr w:type="spellStart"/>
-      <w:r>
-        <w:t>nút</w:t>
-      </w:r>
-      <w:proofErr w:type="spellEnd"/>
-      <w:r>
-        <w:t xml:space="preserve"> publish </w:t>
-      </w:r>
-      <w:proofErr w:type="spellStart"/>
-      <w:r>
-        <w:t>vào</w:t>
-      </w:r>
-      <w:proofErr w:type="spellEnd"/>
-      <w:r>
-        <w:t xml:space="preserve"> </w:t>
-      </w:r>
-      <w:proofErr w:type="spellStart"/>
-      <w:r>
-        <w:t>cột</w:t>
-      </w:r>
-      <w:proofErr w:type="spellEnd"/>
-      <w:r>
-        <w:t xml:space="preserve"> </w:t>
-      </w:r>
-      <w:proofErr w:type="spellStart"/>
-      <w:r>
-        <w:t>trạng</w:t>
-      </w:r>
-      <w:proofErr w:type="spellEnd"/>
-      <w:r>
-        <w:t xml:space="preserve"> </w:t>
-      </w:r>
-      <w:proofErr w:type="spellStart"/>
-      <w:r>
-        <w:t>thái</w:t>
-      </w:r>
-      <w:proofErr w:type="spellEnd"/>
-    </w:p>
-    <w:p>
-      <w:pPr>
-        <w:pStyle w:val="ListParagraph"/>
-        <w:numPr>
-          <w:ilvl w:val="0"/>
-          <w:numId w:val="2"/>
-        </w:numPr>
-      </w:pPr>
-      <w:proofErr w:type="spellStart"/>
-      <w:r>
-        <w:t>Khi</w:t>
-      </w:r>
-      <w:proofErr w:type="spellEnd"/>
-      <w:r>
-        <w:t xml:space="preserve"> </w:t>
-      </w:r>
-      <w:proofErr w:type="spellStart"/>
-      <w:r>
-        <w:t>thêm</w:t>
-      </w:r>
-      <w:proofErr w:type="spellEnd"/>
-      <w:r>
-        <w:t xml:space="preserve"> </w:t>
-      </w:r>
-      <w:proofErr w:type="spellStart"/>
-      <w:r>
-        <w:t>lớp</w:t>
-      </w:r>
-      <w:proofErr w:type="spellEnd"/>
-      <w:r>
-        <w:t xml:space="preserve"> </w:t>
-      </w:r>
-      <w:proofErr w:type="spellStart"/>
-      <w:r>
-        <w:t>ảo</w:t>
-      </w:r>
-      <w:proofErr w:type="spellEnd"/>
-      <w:r>
-        <w:t xml:space="preserve"> </w:t>
-      </w:r>
-      <w:proofErr w:type="spellStart"/>
-      <w:r>
-        <w:t>thì</w:t>
-      </w:r>
-      <w:proofErr w:type="spellEnd"/>
-      <w:r>
-        <w:t xml:space="preserve"> </w:t>
-      </w:r>
-      <w:proofErr w:type="spellStart"/>
-      <w:r>
-        <w:t>khi</w:t>
-      </w:r>
-      <w:proofErr w:type="spellEnd"/>
-      <w:r>
-        <w:t xml:space="preserve"> </w:t>
-      </w:r>
-      <w:proofErr w:type="spellStart"/>
-      <w:r>
-        <w:t>sửa,phải</w:t>
-      </w:r>
-      <w:proofErr w:type="spellEnd"/>
-      <w:r>
-        <w:t xml:space="preserve"> </w:t>
-      </w:r>
-      <w:proofErr w:type="spellStart"/>
-      <w:r>
-        <w:t>giữ</w:t>
-      </w:r>
-      <w:proofErr w:type="spellEnd"/>
-      <w:r>
-        <w:t xml:space="preserve"> </w:t>
-      </w:r>
-      <w:proofErr w:type="spellStart"/>
-      <w:r>
-        <w:t>trạng</w:t>
-      </w:r>
-      <w:proofErr w:type="spellEnd"/>
-      <w:r>
-        <w:t xml:space="preserve"> </w:t>
-      </w:r>
-      <w:proofErr w:type="spellStart"/>
-      <w:r>
-        <w:t>thái</w:t>
-      </w:r>
-      <w:proofErr w:type="spellEnd"/>
-      <w:r>
-        <w:t xml:space="preserve"> </w:t>
-      </w:r>
-      <w:proofErr w:type="spellStart"/>
-      <w:r>
-        <w:t>của</w:t>
-      </w:r>
-      <w:proofErr w:type="spellEnd"/>
-      <w:r>
-        <w:t xml:space="preserve"> </w:t>
-      </w:r>
-      <w:proofErr w:type="spellStart"/>
-      <w:r>
-        <w:t>lớp</w:t>
-      </w:r>
-      <w:proofErr w:type="spellEnd"/>
-      <w:r>
-        <w:t xml:space="preserve">, </w:t>
-      </w:r>
-      <w:proofErr w:type="spellStart"/>
-      <w:r>
-        <w:t>môn</w:t>
-      </w:r>
-      <w:proofErr w:type="spellEnd"/>
-      <w:r>
-        <w:t xml:space="preserve"> </w:t>
-      </w:r>
-      <w:proofErr w:type="spellStart"/>
-      <w:r>
-        <w:t>học</w:t>
-      </w:r>
-      <w:proofErr w:type="spellEnd"/>
-    </w:p>
-    <w:p>
-      <w:pPr>
-        <w:pStyle w:val="ListParagraph"/>
-        <w:numPr>
-          <w:ilvl w:val="0"/>
-          <w:numId w:val="2"/>
-        </w:numPr>
-      </w:pPr>
-      <w:proofErr w:type="spellStart"/>
-      <w:r>
-        <w:t>Phải</w:t>
-      </w:r>
-      <w:proofErr w:type="spellEnd"/>
-      <w:r>
-        <w:t xml:space="preserve"> check </w:t>
-      </w:r>
-      <w:proofErr w:type="spellStart"/>
-      <w:r>
-        <w:t>không</w:t>
-      </w:r>
-      <w:proofErr w:type="spellEnd"/>
-      <w:r>
-        <w:t xml:space="preserve"> </w:t>
-      </w:r>
-      <w:proofErr w:type="spellStart"/>
-      <w:r>
-        <w:t>cho</w:t>
-      </w:r>
-      <w:proofErr w:type="spellEnd"/>
-      <w:r>
-        <w:t xml:space="preserve"> 1 </w:t>
-      </w:r>
-      <w:proofErr w:type="spellStart"/>
-      <w:r>
-        <w:t>ông</w:t>
-      </w:r>
-      <w:proofErr w:type="spellEnd"/>
-      <w:r>
-        <w:t xml:space="preserve"> </w:t>
-      </w:r>
-      <w:proofErr w:type="spellStart"/>
-      <w:r>
-        <w:t>giáo</w:t>
-      </w:r>
-      <w:proofErr w:type="spellEnd"/>
-      <w:r>
-        <w:t xml:space="preserve"> </w:t>
-      </w:r>
-      <w:proofErr w:type="spellStart"/>
-      <w:r>
-        <w:t>viên</w:t>
-      </w:r>
-      <w:proofErr w:type="spellEnd"/>
-      <w:r>
-        <w:t xml:space="preserve">  </w:t>
-      </w:r>
-      <w:proofErr w:type="spellStart"/>
-      <w:r>
-        <w:t>tạo</w:t>
-      </w:r>
-      <w:proofErr w:type="spellEnd"/>
-      <w:r>
-        <w:t xml:space="preserve"> 2 </w:t>
-      </w:r>
-      <w:proofErr w:type="spellStart"/>
-      <w:r>
-        <w:t>lớp</w:t>
-      </w:r>
-      <w:proofErr w:type="spellEnd"/>
-      <w:r>
-        <w:t xml:space="preserve"> y </w:t>
-      </w:r>
-      <w:proofErr w:type="spellStart"/>
-      <w:r>
-        <w:t>chang</w:t>
-      </w:r>
-      <w:proofErr w:type="spellEnd"/>
-      <w:r>
-        <w:t xml:space="preserve"> </w:t>
-      </w:r>
-      <w:proofErr w:type="spellStart"/>
-      <w:r>
-        <w:t>nhau</w:t>
-      </w:r>
-      <w:proofErr w:type="spellEnd"/>
-      <w:r>
-        <w:t>(</w:t>
-      </w:r>
-      <w:proofErr w:type="spellStart"/>
-      <w:r>
-        <w:t>cùng</w:t>
-      </w:r>
-      <w:proofErr w:type="spellEnd"/>
-      <w:r>
-        <w:t xml:space="preserve">  </w:t>
-      </w:r>
-      <w:proofErr w:type="spellStart"/>
-      <w:r>
-        <w:t>lớp,cùng</w:t>
-      </w:r>
-      <w:proofErr w:type="spellEnd"/>
-      <w:r>
-        <w:t xml:space="preserve"> </w:t>
-      </w:r>
-      <w:proofErr w:type="spellStart"/>
-      <w:r>
-        <w:t>giờ</w:t>
-      </w:r>
-      <w:proofErr w:type="spellEnd"/>
-      <w:r>
-        <w:t>)</w:t>
-      </w:r>
-    </w:p>
-    <w:p>
-      <w:pPr>
-        <w:pStyle w:val="ListParagraph"/>
-        <w:numPr>
-          <w:ilvl w:val="0"/>
-          <w:numId w:val="2"/>
-        </w:numPr>
-      </w:pPr>
-      <w:proofErr w:type="spellStart"/>
-      <w:r>
-        <w:t>Khi</w:t>
-      </w:r>
-      <w:proofErr w:type="spellEnd"/>
-      <w:r>
-        <w:t xml:space="preserve"> </w:t>
-      </w:r>
-      <w:proofErr w:type="spellStart"/>
-      <w:r>
-        <w:t>tạo</w:t>
-      </w:r>
-      <w:proofErr w:type="spellEnd"/>
-      <w:r>
-        <w:t xml:space="preserve"> </w:t>
-      </w:r>
-      <w:proofErr w:type="spellStart"/>
-      <w:r>
-        <w:t>lớp</w:t>
-      </w:r>
-      <w:proofErr w:type="spellEnd"/>
-      <w:r>
-        <w:t xml:space="preserve"> start &lt; end </w:t>
-      </w:r>
-      <w:proofErr w:type="spellStart"/>
-      <w:r>
-        <w:t>thì</w:t>
-      </w:r>
-      <w:proofErr w:type="spellEnd"/>
-      <w:r>
-        <w:t xml:space="preserve"> </w:t>
-      </w:r>
-      <w:proofErr w:type="spellStart"/>
-      <w:r>
-        <w:t>phải</w:t>
-      </w:r>
-      <w:proofErr w:type="spellEnd"/>
-      <w:r>
-        <w:t xml:space="preserve"> </w:t>
-      </w:r>
-      <w:proofErr w:type="spellStart"/>
-      <w:r>
-        <w:t>hiện</w:t>
-      </w:r>
-      <w:proofErr w:type="spellEnd"/>
-      <w:r>
-        <w:t xml:space="preserve"> </w:t>
-      </w:r>
-      <w:proofErr w:type="spellStart"/>
-      <w:r>
-        <w:t>ra</w:t>
-      </w:r>
-      <w:proofErr w:type="spellEnd"/>
-      <w:r>
-        <w:t xml:space="preserve"> lỗi</w:t>
-      </w:r>
-      <w:bookmarkStart w:id="0" w:name="_GoBack"/>
-      <w:bookmarkEnd w:id="0"/>
-    </w:p>
     <w:sectPr>
       <w:pgSz w:w="12240" w:h="15840"/>
       <w:pgMar w:top="1440" w:right="1440" w:bottom="1440" w:left="1440" w:header="720" w:footer="720" w:gutter="0"/>
@@ -3260,11 +3906,100 @@
       </w:rPr>
     </w:lvl>
   </w:abstractNum>
+  <w:abstractNum w:abstractNumId="2">
+    <w:nsid w:val="7BFB112F"/>
+    <w:multiLevelType w:val="hybridMultilevel"/>
+    <w:tmpl w:val="E51CF80A"/>
+    <w:lvl w:ilvl="0" w:tplc="0409000F">
+      <w:start w:val="1"/>
+      <w:numFmt w:val="decimal"/>
+      <w:lvlText w:val="%1."/>
+      <w:lvlJc w:val="left"/>
+      <w:pPr>
+        <w:ind w:left="720" w:hanging="360"/>
+      </w:pPr>
+    </w:lvl>
+    <w:lvl w:ilvl="1" w:tplc="04090019" w:tentative="1">
+      <w:start w:val="1"/>
+      <w:numFmt w:val="lowerLetter"/>
+      <w:lvlText w:val="%2."/>
+      <w:lvlJc w:val="left"/>
+      <w:pPr>
+        <w:ind w:left="1440" w:hanging="360"/>
+      </w:pPr>
+    </w:lvl>
+    <w:lvl w:ilvl="2" w:tplc="0409001B" w:tentative="1">
+      <w:start w:val="1"/>
+      <w:numFmt w:val="lowerRoman"/>
+      <w:lvlText w:val="%3."/>
+      <w:lvlJc w:val="right"/>
+      <w:pPr>
+        <w:ind w:left="2160" w:hanging="180"/>
+      </w:pPr>
+    </w:lvl>
+    <w:lvl w:ilvl="3" w:tplc="0409000F" w:tentative="1">
+      <w:start w:val="1"/>
+      <w:numFmt w:val="decimal"/>
+      <w:lvlText w:val="%4."/>
+      <w:lvlJc w:val="left"/>
+      <w:pPr>
+        <w:ind w:left="2880" w:hanging="360"/>
+      </w:pPr>
+    </w:lvl>
+    <w:lvl w:ilvl="4" w:tplc="04090019" w:tentative="1">
+      <w:start w:val="1"/>
+      <w:numFmt w:val="lowerLetter"/>
+      <w:lvlText w:val="%5."/>
+      <w:lvlJc w:val="left"/>
+      <w:pPr>
+        <w:ind w:left="3600" w:hanging="360"/>
+      </w:pPr>
+    </w:lvl>
+    <w:lvl w:ilvl="5" w:tplc="0409001B" w:tentative="1">
+      <w:start w:val="1"/>
+      <w:numFmt w:val="lowerRoman"/>
+      <w:lvlText w:val="%6."/>
+      <w:lvlJc w:val="right"/>
+      <w:pPr>
+        <w:ind w:left="4320" w:hanging="180"/>
+      </w:pPr>
+    </w:lvl>
+    <w:lvl w:ilvl="6" w:tplc="0409000F" w:tentative="1">
+      <w:start w:val="1"/>
+      <w:numFmt w:val="decimal"/>
+      <w:lvlText w:val="%7."/>
+      <w:lvlJc w:val="left"/>
+      <w:pPr>
+        <w:ind w:left="5040" w:hanging="360"/>
+      </w:pPr>
+    </w:lvl>
+    <w:lvl w:ilvl="7" w:tplc="04090019" w:tentative="1">
+      <w:start w:val="1"/>
+      <w:numFmt w:val="lowerLetter"/>
+      <w:lvlText w:val="%8."/>
+      <w:lvlJc w:val="left"/>
+      <w:pPr>
+        <w:ind w:left="5760" w:hanging="360"/>
+      </w:pPr>
+    </w:lvl>
+    <w:lvl w:ilvl="8" w:tplc="0409001B" w:tentative="1">
+      <w:start w:val="1"/>
+      <w:numFmt w:val="lowerRoman"/>
+      <w:lvlText w:val="%9."/>
+      <w:lvlJc w:val="right"/>
+      <w:pPr>
+        <w:ind w:left="6480" w:hanging="180"/>
+      </w:pPr>
+    </w:lvl>
+  </w:abstractNum>
   <w:num w:numId="1">
     <w:abstractNumId w:val="1"/>
   </w:num>
   <w:num w:numId="2">
     <w:abstractNumId w:val="0"/>
+  </w:num>
+  <w:num w:numId="3">
+    <w:abstractNumId w:val="2"/>
   </w:num>
 </w:numbering>
 </file>
@@ -3701,6 +4436,32 @@
       <w:contextualSpacing/>
     </w:pPr>
   </w:style>
+  <w:style w:type="table" w:styleId="TableGrid">
+    <w:name w:val="Table Grid"/>
+    <w:basedOn w:val="TableNormal"/>
+    <w:uiPriority w:val="39"/>
+    <w:rsid w:val="00C64B48"/>
+    <w:pPr>
+      <w:spacing w:after="0" w:line="240" w:lineRule="auto"/>
+    </w:pPr>
+    <w:tblPr>
+      <w:tblInd w:w="0" w:type="dxa"/>
+      <w:tblBorders>
+        <w:top w:val="single" w:sz="4" w:space="0" w:color="auto"/>
+        <w:left w:val="single" w:sz="4" w:space="0" w:color="auto"/>
+        <w:bottom w:val="single" w:sz="4" w:space="0" w:color="auto"/>
+        <w:right w:val="single" w:sz="4" w:space="0" w:color="auto"/>
+        <w:insideH w:val="single" w:sz="4" w:space="0" w:color="auto"/>
+        <w:insideV w:val="single" w:sz="4" w:space="0" w:color="auto"/>
+      </w:tblBorders>
+      <w:tblCellMar>
+        <w:top w:w="0" w:type="dxa"/>
+        <w:left w:w="108" w:type="dxa"/>
+        <w:bottom w:w="0" w:type="dxa"/>
+        <w:right w:w="108" w:type="dxa"/>
+      </w:tblCellMar>
+    </w:tblPr>
+  </w:style>
 </w:styles>
 </file>
 

</xml_diff>